<commit_message>
Madde listesi, atmosfer-müzik-ödül ve spoilersız hikâye kuralları
- icerik_docx.py: madde imli liste için `mad` blok tipi
- arastirma.py: beşinci kaynak olarak Wikipedia (oynanış, hikâye, müzik, ödüller)
- icerik-kurallari: madde listesi kullanımı, atmosfer-müzik-ödül paragrafı,
  spoilersız hikâye anlatımı, giriş yapısının netleşmesi, band 750-850
- dogrulama: ödül/müzik/hikâye kaynak satırları, Metacritic platform farkı,
  silah sınıfı çeviri tuzağı, özel adların birebir aktarılması
- brief-kurallari: kurguya BİÇİM satırı
- kontrol-listesi: yeni maddeler
- BF6 örneği yeni kurallara göre yeniden yazıldı (848 kelime)

Co-Authored-By: Claude Opus 5 <noreply@anthropic.com>
</commit_message>
<xml_diff>
--- a/examples/ornek-icerik-battlefield-6.docx
+++ b/examples/ornek-icerik-battlefield-6.docx
@@ -20,7 +20,7 @@
           <w:color w:val="5A6B68"/>
           <w:sz w:val="17"/>
         </w:rPr>
-        <w:t>Gövde 843 kelime · giriş + 5 H2, 4 H3 · 2 tablo · 6 iç link · 8 SSS · Sayfada H1 oyun adı olarak bulunur; gövde başlıksız kısa girişle açılır, ardından H2'ler gelir</w:t>
+        <w:t>Gövde 847 kelime · giriş + 5 H2, 4 H3 · 2 tablo · 6 iç link · 8 SSS · Sayfada H1 oyun adı olarak bulunur; gövde başlıksız kısa girişle açılır, ardından H2'ler gelir</w:t>
       </w:r>
     </w:p>
     <w:p>
@@ -33,7 +33,7 @@
           <w:color w:val="10332F"/>
           <w:sz w:val="21"/>
         </w:rPr>
-        <w:t>Battlefield serisi 2002'den bu yana geniş ölçekli savaş alanı deneyiminin adı oldu. Electronic Arts ve DICE'ın başını çektiği Battlefield Studios imzalı Battlefield 6 da bu çizgiyi sürdürür: 10 Ekim 2025'te yayımlanan oyun, serinin Battlefield 3 ve Battlefield 4 dönemini referans alır. Yakın gelecekte geçen büyük ölçekli bir birinci şahıs savaş oyunu; geniş savaş alanları, araç çatışmaları ve yıkılabilir yapılarıyla serinin bilinen formülünü yeniden kurar.</w:t>
+        <w:t>Battlefield serisi 2002'den bu yana geniş ölçekli savaş deneyimini öne çıkaran oyunlardan biridir. Electronic Arts ve DICE'ın başını çektiği Battlefield Studios imzalı Battlefield 6 da bu çizgiyi sürdüren bir yapımdır. 10 Ekim 2025'te yayımlanan oyun, serinin Battlefield 3 ve Battlefield 4 dönemini referans alır. Yakın gelecekte geçen büyük ölçekli bir FPS savaş oyunu olan Battlefield 6; geniş savaş alanları, araç çatışmaları ve yıkılabilir yapılarıyla serinin bilinen yapısının imzasını taşır.</w:t>
       </w:r>
     </w:p>
     <w:p>
@@ -46,7 +46,48 @@
           <w:color w:val="10332F"/>
           <w:sz w:val="21"/>
         </w:rPr>
-        <w:t>Oyun hem çok oyunculu modları hem de tek oyunculu hikâyesiyle gelir. Eleştirmenlerden iyi not aldı: Metacritic'te 71 eleştirmen değerlendirmesine göre 100 üzerinden 83 puanda, oyuncu puanı ise 6,8 seviyesinde. Arayüz ve altyazı tarafında İngilizce, Almanca, Fransızca, İspanyolca, Arapça, Japonca ve Korece dahil 13 dil desteklenir; Türkçe dil desteği bulunmaz.</w:t>
+        <w:t>Oyun hem çok oyunculu modları hem de tek oyunculu hikâyesiyle gelir. Eleştirmenlerden aldığı notlar şöyle:</w:t>
+      </w:r>
+    </w:p>
+    <w:p>
+      <w:pPr>
+        <w:pStyle w:val="ListBullet"/>
+        <w:spacing w:after="60"/>
+      </w:pPr>
+      <w:r>
+        <w:rPr>
+          <w:rFonts w:ascii="Calibri" w:hAnsi="Calibri"/>
+          <w:color w:val="10332F"/>
+          <w:sz w:val="21"/>
+        </w:rPr>
+        <w:t>Metacritic: 83/100 (71 eleştirmen oyu)</w:t>
+      </w:r>
+    </w:p>
+    <w:p>
+      <w:pPr>
+        <w:pStyle w:val="ListBullet"/>
+        <w:spacing w:after="60"/>
+      </w:pPr>
+      <w:r>
+        <w:rPr>
+          <w:rFonts w:ascii="Calibri" w:hAnsi="Calibri"/>
+          <w:color w:val="10332F"/>
+          <w:sz w:val="21"/>
+        </w:rPr>
+        <w:t>Metacritic kullanıcı skoru: 6,8 (2.144 oyuncu oyu)</w:t>
+      </w:r>
+    </w:p>
+    <w:p>
+      <w:pPr>
+        <w:spacing w:after="140"/>
+      </w:pPr>
+      <w:r>
+        <w:rPr>
+          <w:rFonts w:ascii="Calibri" w:hAnsi="Calibri"/>
+          <w:color w:val="10332F"/>
+          <w:sz w:val="21"/>
+        </w:rPr>
+        <w:t>Arayüz ve altyazı tarafında İngilizce, Almanca, Fransızca, İspanyolca, Arapça, Japonca ve Korece dahil 13 dil desteklenir; Türkçe dil desteği bulunmaz.</w:t>
       </w:r>
     </w:p>
     <w:p>
@@ -102,7 +143,7 @@
           <w:color w:val="10332F"/>
           <w:sz w:val="21"/>
         </w:rPr>
-        <w:t>Battlefield 6'nın oynanışı, Kinesthetic Combat System adlı yeni hareket ve silah sistemi üzerine kurulu. Nişan alma, koşma ve sipere geçme hareketleri birbirine bağlanır; çatışma serinin önceki oyunlarına göre daha akıcı bir his verir.</w:t>
+        <w:t>Battlefield 6'nın oynanışı, Kinesthetic Combat System adlı yeni hareket ve silah sistemi üzerine kuruludur. Siperden eğilerek nişan alma, giden araca tutunma ve yaralı takım arkadaşını güvenli bir yere çekip ayağa kaldırma gibi hareketler birbirine bağlanır; çatışma serinin önceki oyunlarına göre daha akıcı bir his verir.</w:t>
       </w:r>
     </w:p>
     <w:p>
@@ -115,7 +156,76 @@
           <w:color w:val="10332F"/>
           <w:sz w:val="21"/>
         </w:rPr>
-        <w:t xml:space="preserve">Serinin dört klasik sınıfı geri döndü. Assault ön cepheyi açar, Engineer araçları onarır ve zırhlıları avlar, Support baskı ateşi kurup takımı ayağa kaldırır, Recon ise uzaktan hedef işaretler. Tanklar, helikopterler ve savaş uçakları da yenilenen kullanım hissiyle savaş alanının merkezinde durur. Tactical Destruction sistemi sayesinde duvarlar, çatılar ve köprüler çatışmanın gidişatına göre yıkılır, aynı harita her maçta başka bir şekil alır. Haritalar sezon güncellemeleriyle genişlemeye devam ediyor, yani oyun zaman içinde büyüyor. Kütüphanedeki diğer </w:t>
+        <w:t>Serinin dört klasik sınıfı geri döndü:</w:t>
+      </w:r>
+    </w:p>
+    <w:p>
+      <w:pPr>
+        <w:pStyle w:val="ListBullet"/>
+        <w:spacing w:after="60"/>
+      </w:pPr>
+      <w:r>
+        <w:rPr>
+          <w:rFonts w:ascii="Calibri" w:hAnsi="Calibri"/>
+          <w:color w:val="10332F"/>
+          <w:sz w:val="21"/>
+        </w:rPr>
+        <w:t>Assault: Saldırı tüfekleri ve bombaatarla ön cepheyi açar, canını daha hızlı yeniler.</w:t>
+      </w:r>
+    </w:p>
+    <w:p>
+      <w:pPr>
+        <w:pStyle w:val="ListBullet"/>
+        <w:spacing w:after="60"/>
+      </w:pPr>
+      <w:r>
+        <w:rPr>
+          <w:rFonts w:ascii="Calibri" w:hAnsi="Calibri"/>
+          <w:color w:val="10332F"/>
+          <w:sz w:val="21"/>
+        </w:rPr>
+        <w:t>Engineer: Makineli tabancayla yakın mesafede etkilidir; dost araçları onarır, patlayıcılarla zırhlıları avlar.</w:t>
+      </w:r>
+    </w:p>
+    <w:p>
+      <w:pPr>
+        <w:pStyle w:val="ListBullet"/>
+        <w:spacing w:after="60"/>
+      </w:pPr>
+      <w:r>
+        <w:rPr>
+          <w:rFonts w:ascii="Calibri" w:hAnsi="Calibri"/>
+          <w:color w:val="10332F"/>
+          <w:sz w:val="21"/>
+        </w:rPr>
+        <w:t>Support: Hafif makineli tüfekle baskı ateşi kurar; mühimmat verir, siper yerleştirir, takımı iyileştirip ayağa kaldırır.</w:t>
+      </w:r>
+    </w:p>
+    <w:p>
+      <w:pPr>
+        <w:pStyle w:val="ListBullet"/>
+        <w:spacing w:after="60"/>
+      </w:pPr>
+      <w:r>
+        <w:rPr>
+          <w:rFonts w:ascii="Calibri" w:hAnsi="Calibri"/>
+          <w:color w:val="10332F"/>
+          <w:sz w:val="21"/>
+        </w:rPr>
+        <w:t>Recon: Keskin nişancı tüfeğiyle uzak mesafeyi tutar ve hedef işaretler; kafadan vurduğu rakip ayağa kaldırılamaz.</w:t>
+      </w:r>
+    </w:p>
+    <w:p>
+      <w:pPr>
+        <w:spacing w:after="140"/>
+      </w:pPr>
+      <w:r>
+        <w:rPr>
+          <w:rFonts w:ascii="Calibri" w:hAnsi="Calibri"/>
+          <w:color w:val="10332F"/>
+          <w:sz w:val="21"/>
+        </w:rPr>
+        <w:t xml:space="preserve">Tanklar, helikopterler ve savaş uçakları savaş alanının merkezinde durur. Tactical Destruction sistemi sayesinde duvarlar, çatılar ve köprüler çatışmanın gidişatına göre yıkılır; aynı harita her maçta başka bir şekil alır. Çıkıştaki dokuz haritanın her biri, yakın mesafe çatışması için tasarlanmış Combat Zones adlı dar alanlar da içerir. Kütüphanedeki diğer </w:t>
       </w:r>
       <w:hyperlink r:id="rId9">
         <w:r>
@@ -134,7 +244,20 @@
           <w:color w:val="10332F"/>
           <w:sz w:val="21"/>
         </w:rPr>
-        <w:t xml:space="preserve"> listesine de göz atabilirsin.</w:t>
+        <w:t xml:space="preserve"> listesine göz atabilirsin.</w:t>
+      </w:r>
+    </w:p>
+    <w:p>
+      <w:pPr>
+        <w:spacing w:after="140"/>
+      </w:pPr>
+      <w:r>
+        <w:rPr>
+          <w:rFonts w:ascii="Calibri" w:hAnsi="Calibri"/>
+          <w:color w:val="10332F"/>
+          <w:sz w:val="21"/>
+        </w:rPr>
+        <w:t>Oyunun tonu bilinçli olarak ciddidir ve sanat tasarımı bu tona uyar: yıkılan binanın tozu, çatışma ilerledikçe değişen harita silueti ve sesin geldiği yön atmosferin taşıyıcı unsurlarıdır. Skoru Henry Jackman besteledi, parçalar ise Limp Bizkit imzası taşır. Ses tasarımı The Game Awards 2025'te En İyi Ses Tasarımı ödülünü kazandı; oyun aynı törende En İyi Aksiyon Oyunu ve En İyi Çok Oyunculu Oyun dallarında da aday gösterildi.</w:t>
       </w:r>
     </w:p>
     <w:p>
@@ -149,7 +272,7 @@
           <w:color w:val="10332F"/>
           <w:sz w:val="23"/>
         </w:rPr>
-        <w:t>Çok Oyunculu Modlar ve RedSec</w:t>
+        <w:t>Çok Oyunculu Modlar ve REDSEC</w:t>
       </w:r>
     </w:p>
     <w:p>
@@ -162,7 +285,77 @@
           <w:color w:val="10332F"/>
           <w:sz w:val="21"/>
         </w:rPr>
-        <w:t>Çok oyunculu tarafta serinin klasikleri Conquest, Breakthrough ve Rush ile Battlefield 6'yla gelen Escalation modu bulunur. Team Deathmatch, Domination ve King of the Hill gibi kısa tempolu modlar da listede. Portal ise serinin farklı dönemlerinden haritaları ve silahları bir araya getirip kendi kurallarını kurmana ve topluluğun hazırladığı modları denemene izin verir.</w:t>
+        <w:t>Çok oyunculu tarafta öne çıkan modlar şunlardır:</w:t>
+      </w:r>
+    </w:p>
+    <w:p>
+      <w:pPr>
+        <w:pStyle w:val="ListBullet"/>
+        <w:spacing w:after="60"/>
+      </w:pPr>
+      <w:r>
+        <w:rPr>
+          <w:rFonts w:ascii="Calibri" w:hAnsi="Calibri"/>
+          <w:color w:val="10332F"/>
+          <w:sz w:val="21"/>
+        </w:rPr>
+        <w:t>Conquest: Geniş haritada bayrak noktalarını tutma üzerine kurulu klasik Battlefield modu.</w:t>
+      </w:r>
+    </w:p>
+    <w:p>
+      <w:pPr>
+        <w:pStyle w:val="ListBullet"/>
+        <w:spacing w:after="60"/>
+      </w:pPr>
+      <w:r>
+        <w:rPr>
+          <w:rFonts w:ascii="Calibri" w:hAnsi="Calibri"/>
+          <w:color w:val="10332F"/>
+          <w:sz w:val="21"/>
+        </w:rPr>
+        <w:t>Breakthrough ve Rush: Saldıran ve savunan takımın cepheyi sırayla ileri taşıdığı modlar.</w:t>
+      </w:r>
+    </w:p>
+    <w:p>
+      <w:pPr>
+        <w:pStyle w:val="ListBullet"/>
+        <w:spacing w:after="60"/>
+      </w:pPr>
+      <w:r>
+        <w:rPr>
+          <w:rFonts w:ascii="Calibri" w:hAnsi="Calibri"/>
+          <w:color w:val="10332F"/>
+          <w:sz w:val="21"/>
+        </w:rPr>
+        <w:t>Escalation: Battlefield 6'yla gelen yeni mod; ele geçirilecek nokta sayısı maç ilerledikçe azalır.</w:t>
+      </w:r>
+    </w:p>
+    <w:p>
+      <w:pPr>
+        <w:pStyle w:val="ListBullet"/>
+        <w:spacing w:after="60"/>
+      </w:pPr>
+      <w:r>
+        <w:rPr>
+          <w:rFonts w:ascii="Calibri" w:hAnsi="Calibri"/>
+          <w:color w:val="10332F"/>
+          <w:sz w:val="21"/>
+        </w:rPr>
+        <w:t>Team Deathmatch, Domination ve King of the Hill: Daha kısa ve hızlı tempolu modlar.</w:t>
+      </w:r>
+    </w:p>
+    <w:p>
+      <w:pPr>
+        <w:pStyle w:val="ListBullet"/>
+        <w:spacing w:after="60"/>
+      </w:pPr>
+      <w:r>
+        <w:rPr>
+          <w:rFonts w:ascii="Calibri" w:hAnsi="Calibri"/>
+          <w:color w:val="10332F"/>
+          <w:sz w:val="21"/>
+        </w:rPr>
+        <w:t>Portal: Serinin farklı dönemlerinden harita ve silahları bir araya getirir; kendi kurallarını kurmana ve topluluğun hazırladığı modları denemene izin verir.</w:t>
       </w:r>
     </w:p>
     <w:p>
@@ -175,7 +368,7 @@
           <w:color w:val="10332F"/>
           <w:sz w:val="21"/>
         </w:rPr>
-        <w:t xml:space="preserve">28 Ekim 2025'te oyuna REDSEC eklendi. REDSEC ayrı bir oyun değil, Battlefield 6'nın ücretsiz oynanabilen battle royale modu. Oyunu satın almadan GeForce NOW üzerinden REDSEC'e girebilirsin. Serinin yıkım ve araç mekanikleri burada da geçerli olduğu için tür içinde kendine özgü bir yerde durur. Türün diğer yapımlarını merak ediyorsan </w:t>
+        <w:t xml:space="preserve">28 Ekim 2025'te eklenen REDSEC ayrı bir oyun değil, Battlefield 6'nın ücretsiz oynanan battle royale modudur; oyunu satın almadan GeForce NOW üzerinden girebilirsin. Serinin yıkım ve araç mekanikleri burada da geçerlidir. Türün diğer yapımlarını merak ediyorsan </w:t>
       </w:r>
       <w:hyperlink r:id="rId10">
         <w:r>
@@ -222,7 +415,7 @@
           <w:color w:val="10332F"/>
           <w:sz w:val="21"/>
         </w:rPr>
-        <w:t>Battlefield 6, çok oyunculu modların yanında tek oyunculu bir hikâye modu da sunar. Hikâye 2027-2028 yıllarında, NATO ittifakının zayıfladığı yakın gelecekte geçer; Pax Armata adlı özel askeri şirkete karşı Dagger 13 birliğiyle savaşırsın. Kahire'den Cebelitarık'a uzanan bölümler farklı karakterlerin gözünden ilerler ve sinematik bir anlatı sunar. HowLongToBeat üzerindeki oyuncu verilerine göre ana hikâyeyi bitirmek yaklaşık 6 saat sürer. Hikâye modu, çok oyunculu tarafa geçmeden önce oyunun silah hissini ve sınıf yapısını tanımak için de iyi bir başlangıç noktası.</w:t>
+        <w:t>Battlefield 6, tek oyunculu bir hikâye modu da sunar. Hikâye 2027-2028 yıllarında, NATO ittifakının çözülmeye başladığı yakın gelecekte geçer; Pax Armata adlı özel askeri şirkete karşı savaşan Dagger 1-3 timinin peşinden gidersin. Cebelitarık, Kahire ve New York gibi farklı cephelere uzanan bölümler sinematik bir anlatı kurar. HowLongToBeat verilerine göre ana hikâyeyi bitirmek yaklaşık 6 saat sürer.</w:t>
       </w:r>
     </w:p>
     <w:p>
@@ -269,7 +462,7 @@
           <w:color w:val="10332F"/>
           <w:sz w:val="21"/>
         </w:rPr>
-        <w:t xml:space="preserve"> teknolojisiyle oyun NVIDIA'nın sunucularında çalışır, ekranına yalnızca görüntü akar. Battlefield 6, GeForce NOW tarafında tam optimize edilmiş oyunlar arasında yer alır; yani bulut için ayrıca ayarlanmış halde gelir.</w:t>
+        <w:t xml:space="preserve"> teknolojisiyle oyun NVIDIA'nın sunucularında çalışır, ekranına yalnızca görüntü akar. Battlefield 6, GeForce NOW tarafında tam optimize edilmiş oyunlar arasında yer alır.</w:t>
       </w:r>
     </w:p>
     <w:p>
@@ -282,7 +475,7 @@
           <w:color w:val="10332F"/>
           <w:sz w:val="21"/>
         </w:rPr>
-        <w:t>Bu yapı üç şeyi değiştirir. NVIDIA Reflex ile tetiğe basman ile ekrandaki karşılığı arasındaki gecikme düşer, yeni bir sezon güncellemesi çıktığında indirme beklemeden oynamaya devam edersin ve aynı kütüphane zayıf donanımlı bir dizüstünde, Mac'te, televizyonda ve akıllı telefonda açılır. Battlefield 6 klavye ve fare ile oynanabildiği gibi gamepad de destekler; telefonda ya da televizyonda oynarken kumandanı bağlayıp aynı deneyimi sürdürebilirsin.</w:t>
+        <w:t>Bu yapı üç şeyi değiştirir. NVIDIA Reflex tetiğe basman ile ekrandaki karşılığı arasındaki gecikmeyi düşürür, yeni bir güncelleme çıktığında indirme beklemezsin ve aynı kütüphane zayıf donanımlı bir dizüstünde, Mac'te, televizyonda ve akıllı telefonda açılır. Oyun klavye ve fare ile oynanabildiği gibi gamepad de destekler.</w:t>
       </w:r>
     </w:p>
     <w:p>
@@ -310,7 +503,7 @@
           <w:color w:val="10332F"/>
           <w:sz w:val="21"/>
         </w:rPr>
-        <w:t xml:space="preserve">Steam ya da EA App üzerinden sahip olduğun Battlefield 6, aynı hesapla GeForce NOW'da açılır; oyunu ikinci kez satın alman gerekmez. Ücretsiz REDSEC modu içinse oyuna sahip olman da gerekmez. Oynamaya başlamadan önce </w:t>
+        <w:t xml:space="preserve">Sahip olduğun oyun aynı hesapla GeForce NOW'da açılır; ikinci kez satın alman gerekmez. Oynamaya başlamadan önce </w:t>
       </w:r>
       <w:hyperlink r:id="rId12">
         <w:r>
@@ -626,7 +819,7 @@
           <w:color w:val="10332F"/>
           <w:sz w:val="21"/>
         </w:rPr>
-        <w:t>Battlefield 6 GeForce NOW üzerinde HDR ve NVIDIA Reflex destekler. Reflex, nişan alıp ateş ettiğin anın ekrana yansıma süresini kısalttığı için çok oyunculu maçlarda hissedilir bir fark yaratır. Kablolu bağlantı ya da 5 GHz Wi-Fi kullanmak, akışın dalgalanmasını azaltır.</w:t>
+        <w:t>Battlefield 6 GeForce NOW üzerinde HDR ve NVIDIA Reflex destekler. Reflex, ateş ettiğin anın ekrana yansıma süresini kısalttığı için çok oyunculu maçlarda hissedilir bir fark yaratır. Kablolu bağlantı ya da 5 GHz Wi-Fi, akışın dalgalanmasını azaltır.</w:t>
       </w:r>
     </w:p>
     <w:p>
@@ -654,7 +847,7 @@
           <w:color w:val="10332F"/>
           <w:sz w:val="21"/>
         </w:rPr>
-        <w:t>PC sürümünün resmi gereksinimleri şöyle:</w:t>
+        <w:t>PC sürümünün resmi gereksinimleri şöyledir:</w:t>
       </w:r>
     </w:p>
     <w:tbl>
@@ -1040,7 +1233,7 @@
           <w:color w:val="10332F"/>
           <w:sz w:val="21"/>
         </w:rPr>
-        <w:t>Bunlara ek olarak Javelin hile önleme sistemi için bilgisayarında TPM 2.0 ve UEFI Secure Boot açık olmalı. Oyun DirectX 12, DLSS 4 Multi Frame Generation ve NVIDIA Reflex destekler.</w:t>
+        <w:t>Bunlara ek olarak Javelin hile önleme sistemi için bilgisayarında TPM 2.0 ve UEFI Secure Boot açık olmalıdır. Oyun DirectX 12, DLSS 4 Multi Frame Generation ve NVIDIA Reflex destekler.</w:t>
       </w:r>
     </w:p>
     <w:p>
@@ -1053,7 +1246,7 @@
           <w:color w:val="10332F"/>
           <w:sz w:val="21"/>
         </w:rPr>
-        <w:t xml:space="preserve">GeForce NOW üzerinden oynarken bu yükün hiçbiri senin cihazında olmaz. İndirme, kurulum, güncelleme ve donanım gereksinimleri sunucu tarafında kalır; bilgisayarının oyunu kaldırıp kaldırmadığı sorusu ortadan kalkar. Diskte 55 ile 80 GB arasında yer açmak, ekran kartını yükseltmek ya da Secure Boot ayarlarıyla uğraşmak gerekmez; Oynat'a bastığın anda savaş alanına girersin. PC sürümünün gereksinimlerini ayrıntılı görmek istersen </w:t>
+        <w:t xml:space="preserve">GeForce NOW üzerinden oynarken bu yükün hiçbiri senin cihazında olmaz: disk açmak, ekran kartını yükseltmek ya da Secure Boot ayarlarıyla uğraşmak gerekmez. Ayrıntılı gereksinimleri görmek istersen </w:t>
       </w:r>
       <w:hyperlink r:id="rId13">
         <w:r>
@@ -1100,7 +1293,7 @@
           <w:color w:val="10332F"/>
           <w:sz w:val="21"/>
         </w:rPr>
-        <w:t xml:space="preserve">Battlefield 6'nın tamamı ücretsiz değil, ancak battle royale modu REDSEC ücretsiz oynanır. Oyunun tam sürümü için Steam ya da EA App üzerinden oyuna sahip olman gerekir. REDSEC'i denedikten sonra tam sürüme geçersen, sahip olduğun oyun aynı GeForce NOW hesabında görünür. Kütüphanedeki </w:t>
+        <w:t xml:space="preserve">Battlefield 6'nın tamamı ücretsiz değil, ancak battle royale modu REDSEC ücretsiz oynanır. Tam sürüm için Steam ya da EA App üzerinden oyuna sahip olman gerekir. Kütüphanedeki </w:t>
       </w:r>
       <w:hyperlink r:id="rId14">
         <w:r>
@@ -1323,7 +1516,7 @@
           <w:color w:val="10332F"/>
           <w:sz w:val="21"/>
         </w:rPr>
-        <w:t>Evet. Battlefield 6 tek oyunculu bir hikâye modu sunar ve HowLongToBeat verilerine göre ana hikâye yaklaşık 6 saat sürer. Hikâye 2027-2028 yıllarında, Pax Armata adlı özel askeri şirkete karşı Dagger 13 birliğiyle geçer.</w:t>
+        <w:t>Evet. Battlefield 6 tek oyunculu bir hikâye modu sunar ve HowLongToBeat verilerine göre ana hikâye yaklaşık 6 saat sürer. Hikâye 2027-2028 yıllarında, Pax Armata adlı özel askeri şirkete karşı Dagger 1-3 birliğiyle geçer.</w:t>
       </w:r>
     </w:p>
     <w:p>
@@ -1426,7 +1619,7 @@
           <w:color w:val="5A6B68"/>
           <w:sz w:val="17"/>
         </w:rPr>
-        <w:t>Türkçe dil desteği bulunmadığı bilgisi Steam mağaza sayfasının resmi dil listesinden alınmıştır; ayrı bir H2 ve SSS sorusu açılmamış, girişte tek cümleyle belirtilmiştir. Sistem gereksinimleri Steam, hikâye süresi HowLongToBeat, Metacritic puanı metacritic.com, paket ve sunucu değerleri gameplus.com.tr/gfn/paketler kaynaklıdır.</w:t>
+        <w:t>Türkçe dil desteğinin bulunmadığı bilgisi ve 13 dillik liste Steam mağaza sayfasının resmi dil listesinden alınmıştır. Metacritic puanı ve oyuncu skoru metacritic.com oyun sayfasından (PC'ye özel puan 82/100, 64 eleştirmen), ödüller The Game Awards 2025 kazanan listesinden, hikâye süresi HowLongToBeat'ten, sınıf ve mod açıklamaları oyunun kendi tanımlarından, paket ve sunucu değerleri gameplus.com.tr/gfn/paketler sayfasından alınmıştır. Hikâye bölümünde olay örgüsü açıklanmamış, yalnız kurulum ve geçtiği yerler verilmiştir.</w:t>
       </w:r>
     </w:p>
     <w:sectPr>

</xml_diff>

<commit_message>
Sayfa PC sürümünü anlatır kuralı ve dil düzeltmeleri
- Puan, sistem gereksinimleri, kurulum boyutu ve dil listesi PC sütunundan alınır;
  Metacritic sayfa başlığındaki puan PC'ninki olmayabilir (BF6: başlık 83, PC 82)
- Kullanıcı skorunun platform bazında ayrışmadığı not edildi
- BF6 örneği PC puanına çevrildi, "skoru besteledi" ve "timin peşinden gidersin"
  gibi anlaşılmayan ifadeler düzeltildi

Co-Authored-By: Claude Opus 5 <noreply@anthropic.com>
</commit_message>
<xml_diff>
--- a/examples/ornek-icerik-battlefield-6.docx
+++ b/examples/ornek-icerik-battlefield-6.docx
@@ -20,7 +20,7 @@
           <w:color w:val="5A6B68"/>
           <w:sz w:val="17"/>
         </w:rPr>
-        <w:t>Gövde 847 kelime · giriş + 5 H2, 4 H3 · 2 tablo · 6 iç link · 8 SSS · Sayfada H1 oyun adı olarak bulunur; gövde başlıksız kısa girişle açılır, ardından H2'ler gelir</w:t>
+        <w:t>Gövde 857 kelime · giriş + 5 H2, 4 H3 · 2 tablo · 6 iç link · 8 SSS · Sayfada H1 oyun adı olarak bulunur; gövde başlıksız kısa girişle açılır, ardından H2'ler gelir</w:t>
       </w:r>
     </w:p>
     <w:p>
@@ -33,7 +33,7 @@
           <w:color w:val="10332F"/>
           <w:sz w:val="21"/>
         </w:rPr>
-        <w:t>Battlefield serisi 2002'den bu yana geniş ölçekli savaş deneyimini öne çıkaran oyunlardan biridir. Electronic Arts ve DICE'ın başını çektiği Battlefield Studios imzalı Battlefield 6 da bu çizgiyi sürdüren bir yapımdır. 10 Ekim 2025'te yayımlanan oyun, serinin Battlefield 3 ve Battlefield 4 dönemini referans alır. Yakın gelecekte geçen büyük ölçekli bir FPS savaş oyunu olan Battlefield 6; geniş savaş alanları, araç çatışmaları ve yıkılabilir yapılarıyla serinin bilinen yapısının imzasını taşır.</w:t>
+        <w:t>Battlefield serisi 2002'den bu yana geniş ölçekli savaş deneyimini öne çıkaran oyunlardan biridir. Electronic Arts ve DICE'ın başını çektiği Battlefield Studios imzalı Battlefield 6 da bu çizgiyi sürdüren bir yapımdır. 10 Ekim 2025'te yayımlanan oyun, serinin Battlefield 3 ve Battlefield 4 dönemini referans alır. Yakın gelecekte geçen büyük ölçekli bir FPS savaş oyunu olan Battlefield 6; geniş savaş alanları, araç çatışmaları ve yıkılabilir yapılarıyla serinin bilinen imzasını taşır.</w:t>
       </w:r>
     </w:p>
     <w:p>
@@ -46,7 +46,7 @@
           <w:color w:val="10332F"/>
           <w:sz w:val="21"/>
         </w:rPr>
-        <w:t>Oyun hem çok oyunculu modları hem de tek oyunculu hikâyesiyle gelir. Eleştirmenlerden aldığı notlar şöyle:</w:t>
+        <w:t>Oyun hem çok oyunculu modları hem de tek oyunculu hikâyesiyle gelir. Aldığı puanlar şöyle:</w:t>
       </w:r>
     </w:p>
     <w:p>
@@ -60,7 +60,7 @@
           <w:color w:val="10332F"/>
           <w:sz w:val="21"/>
         </w:rPr>
-        <w:t>Metacritic: 83/100 (71 eleştirmen oyu)</w:t>
+        <w:t>Metacritic PC puanı: 82/100 (64 eleştirmen oyu)</w:t>
       </w:r>
     </w:p>
     <w:p>
@@ -143,7 +143,7 @@
           <w:color w:val="10332F"/>
           <w:sz w:val="21"/>
         </w:rPr>
-        <w:t>Battlefield 6'nın oynanışı, Kinesthetic Combat System adlı yeni hareket ve silah sistemi üzerine kuruludur. Siperden eğilerek nişan alma, giden araca tutunma ve yaralı takım arkadaşını güvenli bir yere çekip ayağa kaldırma gibi hareketler birbirine bağlanır; çatışma serinin önceki oyunlarına göre daha akıcı bir his verir.</w:t>
+        <w:t>Battlefield 6'nın oynanışı, Kinesthetic Combat System adlı yeni hareket ve silah sistemi üzerine kuruludur. Siperden eğilerek nişan alma, hareket hâlindeki araca tutunma ve yaralı takım arkadaşını güvenli bir yere çekip ayağa kaldırma gibi hareketler birbirine bağlanır; çatışma serinin önceki oyunlarına göre daha akıcı bir his verir.</w:t>
       </w:r>
     </w:p>
     <w:p>
@@ -225,7 +225,7 @@
           <w:color w:val="10332F"/>
           <w:sz w:val="21"/>
         </w:rPr>
-        <w:t xml:space="preserve">Tanklar, helikopterler ve savaş uçakları savaş alanının merkezinde durur. Tactical Destruction sistemi sayesinde duvarlar, çatılar ve köprüler çatışmanın gidişatına göre yıkılır; aynı harita her maçta başka bir şekil alır. Çıkıştaki dokuz haritanın her biri, yakın mesafe çatışması için tasarlanmış Combat Zones adlı dar alanlar da içerir. Kütüphanedeki diğer </w:t>
+        <w:t xml:space="preserve">Tanklar, helikopterler ve savaş uçakları oynanışın merkezinde yer alır. Tactical Destruction sistemi sayesinde duvarlar, çatılar ve köprüler çatışmanın gidişatına göre yıkılır; aynı harita her maçta başka bir şekil alır. Çıkıştaki dokuz haritanın her biri, yakın mesafe çatışması için tasarlanmış Combat Zones adlı dar alanlar da içerir. Kütüphanedeki diğer </w:t>
       </w:r>
       <w:hyperlink r:id="rId9">
         <w:r>
@@ -257,7 +257,7 @@
           <w:color w:val="10332F"/>
           <w:sz w:val="21"/>
         </w:rPr>
-        <w:t>Oyunun tonu bilinçli olarak ciddidir ve sanat tasarımı bu tona uyar: yıkılan binanın tozu, çatışma ilerledikçe değişen harita silueti ve sesin geldiği yön atmosferin taşıyıcı unsurlarıdır. Skoru Henry Jackman besteledi, parçalar ise Limp Bizkit imzası taşır. Ses tasarımı The Game Awards 2025'te En İyi Ses Tasarımı ödülünü kazandı; oyun aynı törende En İyi Aksiyon Oyunu ve En İyi Çok Oyunculu Oyun dallarında da aday gösterildi.</w:t>
+        <w:t>Oyunun tonu bilinçli olarak ciddidir ve sanat tasarımı bu tona uyar: yıkılan binanın tozu, çatışma ilerledikçe değişen harita silueti ve sesin geldiği yön atmosferin taşıyıcı unsurlarıdır. Oyunun müziğini Henry Jackman besteledi, şarkı seçkisinde ise Limp Bizkit yer aldı. Ses tasarımı The Game Awards 2025'te En İyi Ses Tasarımı ödülünü kazandı; oyun aynı törende En İyi Aksiyon Oyunu ve En İyi Çok Oyunculu Oyun dallarında da aday gösterildi.</w:t>
       </w:r>
     </w:p>
     <w:p>
@@ -415,7 +415,7 @@
           <w:color w:val="10332F"/>
           <w:sz w:val="21"/>
         </w:rPr>
-        <w:t>Battlefield 6, tek oyunculu bir hikâye modu da sunar. Hikâye 2027-2028 yıllarında, NATO ittifakının çözülmeye başladığı yakın gelecekte geçer; Pax Armata adlı özel askeri şirkete karşı savaşan Dagger 1-3 timinin peşinden gidersin. Cebelitarık, Kahire ve New York gibi farklı cephelere uzanan bölümler sinematik bir anlatı kurar. HowLongToBeat verilerine göre ana hikâyeyi bitirmek yaklaşık 6 saat sürer.</w:t>
+        <w:t>Battlefield 6, tek oyunculu bir hikâye modu da sunar. Hikâye 2027-2028 yıllarında, NATO ittifakının çözülmeye başladığı yakın gelecekte geçer; Pax Armata adlı özel askeri şirkete karşı savaşan Dagger 1-3 timiyle oynarsın. Bölümler Cebelitarık, Kahire ve New York gibi farklı cephelerde geçer, aralarını sinematik sahneler bağlar. HowLongToBeat verilerine göre ana hikâyeyi bitirmek yaklaşık 6 saat sürer.</w:t>
       </w:r>
     </w:p>
     <w:p>
@@ -503,7 +503,7 @@
           <w:color w:val="10332F"/>
           <w:sz w:val="21"/>
         </w:rPr>
-        <w:t xml:space="preserve">Sahip olduğun oyun aynı hesapla GeForce NOW'da açılır; ikinci kez satın alman gerekmez. Oynamaya başlamadan önce </w:t>
+        <w:t xml:space="preserve">Steam ya da EA App kütüphanendeki Battlefield 6, aynı hesapla GeForce NOW'da açılır; oyunu ikinci kez satın alman gerekmez. Oynamaya başlamadan önce </w:t>
       </w:r>
       <w:hyperlink r:id="rId12">
         <w:r>
@@ -1246,7 +1246,7 @@
           <w:color w:val="10332F"/>
           <w:sz w:val="21"/>
         </w:rPr>
-        <w:t xml:space="preserve">GeForce NOW üzerinden oynarken bu yükün hiçbiri senin cihazında olmaz: disk açmak, ekran kartını yükseltmek ya da Secure Boot ayarlarıyla uğraşmak gerekmez. Ayrıntılı gereksinimleri görmek istersen </w:t>
+        <w:t xml:space="preserve">GeForce NOW üzerinden oynarken bu yükün hiçbiri senin cihazında olmaz: diskte yer açmak, ekran kartını yükseltmek ya da Secure Boot ayarlarıyla uğraşmak gerekmez. Ayrıntılı gereksinimleri görmek istersen </w:t>
       </w:r>
       <w:hyperlink r:id="rId13">
         <w:r>
@@ -1516,7 +1516,7 @@
           <w:color w:val="10332F"/>
           <w:sz w:val="21"/>
         </w:rPr>
-        <w:t>Evet. Battlefield 6 tek oyunculu bir hikâye modu sunar ve HowLongToBeat verilerine göre ana hikâye yaklaşık 6 saat sürer. Hikâye 2027-2028 yıllarında, Pax Armata adlı özel askeri şirkete karşı Dagger 1-3 birliğiyle geçer.</w:t>
+        <w:t>Evet. Battlefield 6 tek oyunculu bir hikâye modu sunar ve HowLongToBeat verilerine göre ana hikâye yaklaşık 6 saat sürer. Hikâye 2027-2028 yıllarında geçer; Pax Armata adlı özel askeri şirkete karşı savaşan Dagger 1-3 timiyle oynarsın.</w:t>
       </w:r>
     </w:p>
     <w:p>
@@ -1619,7 +1619,7 @@
           <w:color w:val="5A6B68"/>
           <w:sz w:val="17"/>
         </w:rPr>
-        <w:t>Türkçe dil desteğinin bulunmadığı bilgisi ve 13 dillik liste Steam mağaza sayfasının resmi dil listesinden alınmıştır. Metacritic puanı ve oyuncu skoru metacritic.com oyun sayfasından (PC'ye özel puan 82/100, 64 eleştirmen), ödüller The Game Awards 2025 kazanan listesinden, hikâye süresi HowLongToBeat'ten, sınıf ve mod açıklamaları oyunun kendi tanımlarından, paket ve sunucu değerleri gameplus.com.tr/gfn/paketler sayfasından alınmıştır. Hikâye bölümünde olay örgüsü açıklanmamış, yalnız kurulum ve geçtiği yerler verilmiştir.</w:t>
+        <w:t>Türkçe dil desteğinin bulunmadığı bilgisi ve 13 dillik liste Steam mağaza sayfasının resmi dil listesinden alınmıştır. Metacritic puanı PC sürümüne aittir (82/100, 64 eleştirmen); PS5 83, Xbox Series X 84 puandadır. Kullanıcı skoru Metacritic'te platform bazında ayrışmaz. Ödüller The Game Awards 2025 kazanan listesinden, besteci ve müzik bilgisi oyunun künyesinden, hikâye süresi HowLongToBeat'ten, sınıf ve mod açıklamaları oyunun kendi tanımlarından, paket ve sunucu değerleri gameplus.com.tr/gfn/paketler sayfasından alınmıştır. Hikâye bölümünde olay örgüsü açıklanmamış, yalnız kurulum ve geçtiği yerler verilmiştir.</w:t>
       </w:r>
     </w:p>
     <w:sectPr>

</xml_diff>

<commit_message>
Dört kipli anlatım kuralı
Tek kipe kilitlenen metin makine çıktısı gibi okunuyor. Kip artık cümlenin
işine göre seçiliyor: tanım ve kural geniş zaman, kaynaklı veri -mektedir,
anlatı ve atmosfer şimdiki zaman, okuyucuya yönerge ikinci tekil. Hikâye
anlatımında birinci çoğul serbest, erişim adımlarında değil.

BF6 örneği bu dağılıma çekildi (865 kelimede 8 -iyor, 4 -mektedir).

Co-Authored-By: Claude Opus 5 <noreply@anthropic.com>
</commit_message>
<xml_diff>
--- a/examples/ornek-icerik-battlefield-6.docx
+++ b/examples/ornek-icerik-battlefield-6.docx
@@ -20,7 +20,7 @@
           <w:color w:val="5A6B68"/>
           <w:sz w:val="17"/>
         </w:rPr>
-        <w:t>Gövde 857 kelime · giriş + 5 H2, 4 H3 · 2 tablo · 6 iç link · 8 SSS · Sayfada H1 oyun adı olarak bulunur; gövde başlıksız kısa girişle açılır, ardından H2'ler gelir</w:t>
+        <w:t>Gövde 865 kelime · giriş + 5 H2, 4 H3 · 2 tablo · 6 iç link · 8 SSS · Sayfada H1 oyun adı olarak bulunur; gövde başlıksız kısa girişle açılır, ardından H2'ler gelir</w:t>
       </w:r>
     </w:p>
     <w:p>
@@ -87,7 +87,7 @@
           <w:color w:val="10332F"/>
           <w:sz w:val="21"/>
         </w:rPr>
-        <w:t>Arayüz ve altyazı tarafında İngilizce, Almanca, Fransızca, İspanyolca, Arapça, Japonca ve Korece dahil 13 dil desteklenir; Türkçe dil desteği bulunmaz.</w:t>
+        <w:t>Arayüz ve altyazı tarafında İngilizce, Almanca, Fransızca, İspanyolca, Arapça, Japonca ve Korece dahil 13 dil desteklenmektedir; Türkçe dil desteği bulunmaz.</w:t>
       </w:r>
     </w:p>
     <w:p>
@@ -143,7 +143,7 @@
           <w:color w:val="10332F"/>
           <w:sz w:val="21"/>
         </w:rPr>
-        <w:t>Battlefield 6'nın oynanışı, Kinesthetic Combat System adlı yeni hareket ve silah sistemi üzerine kuruludur. Siperden eğilerek nişan alma, hareket hâlindeki araca tutunma ve yaralı takım arkadaşını güvenli bir yere çekip ayağa kaldırma gibi hareketler birbirine bağlanır; çatışma serinin önceki oyunlarına göre daha akıcı bir his verir.</w:t>
+        <w:t>Battlefield 6'nın oynanışı, Kinesthetic Combat System adlı yeni hareket ve silah sistemi üzerine kurulu. Siperden eğilerek nişan alma, hareket hâlindeki araca tutunma ve yaralı takım arkadaşını güvenli bir yere çekip ayağa kaldırma gibi hareketler birbirine bağlanır; çatışma serinin önceki oyunlarına göre daha akıcı bir his veriyor.</w:t>
       </w:r>
     </w:p>
     <w:p>
@@ -225,7 +225,7 @@
           <w:color w:val="10332F"/>
           <w:sz w:val="21"/>
         </w:rPr>
-        <w:t xml:space="preserve">Tanklar, helikopterler ve savaş uçakları oynanışın merkezinde yer alır. Tactical Destruction sistemi sayesinde duvarlar, çatılar ve köprüler çatışmanın gidişatına göre yıkılır; aynı harita her maçta başka bir şekil alır. Çıkıştaki dokuz haritanın her biri, yakın mesafe çatışması için tasarlanmış Combat Zones adlı dar alanlar da içerir. Kütüphanedeki diğer </w:t>
+        <w:t xml:space="preserve">Tanklar, helikopterler ve savaş uçakları oynanışın merkezinde yer alıyor. Tactical Destruction sistemi sayesinde duvarlar, çatılar ve köprüler çatışmanın gidişatına göre yıkılır; aynı harita her maçta başka bir şekil alır. Çıkıştaki dokuz haritanın her biri, yakın mesafe çatışması için tasarlanmış Combat Zones adlı dar alanlar da içerir. Kütüphanedeki diğer </w:t>
       </w:r>
       <w:hyperlink r:id="rId9">
         <w:r>
@@ -257,7 +257,7 @@
           <w:color w:val="10332F"/>
           <w:sz w:val="21"/>
         </w:rPr>
-        <w:t>Oyunun tonu bilinçli olarak ciddidir ve sanat tasarımı bu tona uyar: yıkılan binanın tozu, çatışma ilerledikçe değişen harita silueti ve sesin geldiği yön atmosferin taşıyıcı unsurlarıdır. Oyunun müziğini Henry Jackman besteledi, şarkı seçkisinde ise Limp Bizkit yer aldı. Ses tasarımı The Game Awards 2025'te En İyi Ses Tasarımı ödülünü kazandı; oyun aynı törende En İyi Aksiyon Oyunu ve En İyi Çok Oyunculu Oyun dallarında da aday gösterildi.</w:t>
+        <w:t>Oyunun tonu bilinçli olarak ciddidir ve sanat tasarımı bu tona uyar: yıkılan binanın tozu, çatışma ilerledikçe değişen harita silueti ve sesin geldiği yön atmosferi taşıyan unsurlar arasında yer alıyor. Oyunun müziğini Henry Jackman besteledi, şarkı seçkisinde ise Limp Bizkit yer aldı. Ses tasarımı The Game Awards 2025'te En İyi Ses Tasarımı ödülünü kazandı; oyun aynı törende En İyi Aksiyon Oyunu ve En İyi Çok Oyunculu Oyun dallarında da aday gösterildi.</w:t>
       </w:r>
     </w:p>
     <w:p>
@@ -415,7 +415,7 @@
           <w:color w:val="10332F"/>
           <w:sz w:val="21"/>
         </w:rPr>
-        <w:t>Battlefield 6, tek oyunculu bir hikâye modu da sunar. Hikâye 2027-2028 yıllarında, NATO ittifakının çözülmeye başladığı yakın gelecekte geçer; Pax Armata adlı özel askeri şirkete karşı savaşan Dagger 1-3 timiyle oynarsın. Bölümler Cebelitarık, Kahire ve New York gibi farklı cephelerde geçer, aralarını sinematik sahneler bağlar. HowLongToBeat verilerine göre ana hikâyeyi bitirmek yaklaşık 6 saat sürer.</w:t>
+        <w:t>Battlefield 6, tek oyunculu bir hikâye modu da sunar. Hikâye 2027-2028 yıllarında, NATO ittifakının dağılmaya başladığı yakın bir alternatif gelecekte geçiyor. Oyunun hikâyesinde Pax Armata adlı özel askeri şirkete karşı savaşan Dagger 1-3 timiyle oyuna başlıyoruz. Bölümler Cebelitarık, Kahire ve New York gibi farklı cephelerde geçiyor, aralarını sinematik geçişler bağlıyor. HowLongToBeat verilerine göre ana hikâyeyi bitirmek yaklaşık 6 saat sürmektedir.</w:t>
       </w:r>
     </w:p>
     <w:p>
@@ -462,7 +462,7 @@
           <w:color w:val="10332F"/>
           <w:sz w:val="21"/>
         </w:rPr>
-        <w:t xml:space="preserve"> teknolojisiyle oyun NVIDIA'nın sunucularında çalışır, ekranına yalnızca görüntü akar. Battlefield 6, GeForce NOW tarafında tam optimize edilmiş oyunlar arasında yer alır.</w:t>
+        <w:t xml:space="preserve"> teknolojisiyle oyun NVIDIA'nın sunucularında çalışır, ekranına yalnızca görüntü akar. Battlefield 6, GeForce NOW tarafında tam optimize edilmiş oyunlar arasında yer almaktadır.</w:t>
       </w:r>
     </w:p>
     <w:p>
@@ -522,7 +522,7 @@
           <w:color w:val="10332F"/>
           <w:sz w:val="21"/>
         </w:rPr>
-        <w:t xml:space="preserve"> arasından kullanım alışkanlığına uyanı seçebilirsin. Performance tarafında 1440p ve 60 FPS'e kadar akış ile 6 saatlik oturum, Ultimate tarafında GeForce RTX 4080 sunucular, 4K HDR, 240 FPS'e kadar akış ile 8 saatlik oturum sunulur.</w:t>
+        <w:t xml:space="preserve"> arasından kullanım alışkanlığına uyanı seçebilirsin. Performance tarafında 1440p ve 60 FPS'e kadar akış ile 6 saatlik oturum, Ultimate tarafında GeForce RTX 4080 sunucular, 4K HDR, 240 FPS'e kadar akış ile 8 saatlik oturum sunulmaktadır.</w:t>
       </w:r>
     </w:p>
     <w:p>
@@ -1516,7 +1516,7 @@
           <w:color w:val="10332F"/>
           <w:sz w:val="21"/>
         </w:rPr>
-        <w:t>Evet. Battlefield 6 tek oyunculu bir hikâye modu sunar ve HowLongToBeat verilerine göre ana hikâye yaklaşık 6 saat sürer. Hikâye 2027-2028 yıllarında geçer; Pax Armata adlı özel askeri şirkete karşı savaşan Dagger 1-3 timiyle oynarsın.</w:t>
+        <w:t>Evet. Battlefield 6 tek oyunculu bir hikâye modu sunar ve HowLongToBeat verilerine göre ana hikâye yaklaşık 6 saat sürmektedir. Hikâye 2027-2028 yıllarında geçiyor; Pax Armata adlı özel askeri şirkete karşı savaşan Dagger 1-3 timiyle oynuyoruz.</w:t>
       </w:r>
     </w:p>
     <w:p>

</xml_diff>

<commit_message>
Kip geçişlerinde köprü, başlıkta en fazla iki konu
- Bir cümle -iyor ile biterken sonraki -mıştır ile başlarsa metin zıplıyor;
  aynı kipteki cümleler yan yana toplanır ya da geçişe köprü ifade konur
- Başlık en fazla iki konu taşır ("Atmosferi, Ses Tasarımı ve Müziği" değil
  "Atmosferi ve Ses Tasarımı")
- "Skor" müzik anlamında kullanılmaz, puanla karışıyor
- BF6 örneğinde atmosfer bölümü yeniden yazıldı, oynanışa takım oyunu ve
  araç dengesi eklendi (1480 kelime)

Co-Authored-By: Claude Opus 5 <noreply@anthropic.com>
</commit_message>
<xml_diff>
--- a/examples/ornek-icerik-battlefield-6.docx
+++ b/examples/ornek-icerik-battlefield-6.docx
@@ -20,7 +20,7 @@
           <w:color w:val="5A6B68"/>
           <w:sz w:val="17"/>
         </w:rPr>
-        <w:t>Gövde 1326 kelime · giriş + 8 H2, 3 H3 · 2 tablo · 6 iç link · 8 SSS · Sayfada H1 oyun adı olarak bulunur; gövde başlıksız kısa girişle açılır, ardından H2'ler gelir</w:t>
+        <w:t>Gövde 1480 kelime · giriş + 8 H2, 3 H3 · 2 tablo · 6 iç link · 8 SSS · Sayfada H1 oyun adı olarak bulunur; gövde başlıksız kısa girişle açılır, ardından H2'ler gelir</w:t>
       </w:r>
     </w:p>
     <w:p>
@@ -231,7 +231,7 @@
           <w:color w:val="10332F"/>
           <w:sz w:val="21"/>
         </w:rPr>
-        <w:t xml:space="preserve">Battlefield 6, Battlefield 4'ten sonra seriye doğrusal bir hikâye modunu geri getirmiştir. Hikâye 2027-2028 yıllarında, </w:t>
+        <w:t xml:space="preserve">Doğrusal hikâye modu, Battlefield 4'ten sonra ilk kez Battlefield 6 ile seriye geri döndü. Hikâye 2027-2028 yıllarında, </w:t>
       </w:r>
       <w:r>
         <w:rPr>
@@ -291,7 +291,7 @@
           <w:color w:val="10332F"/>
           <w:sz w:val="21"/>
         </w:rPr>
-        <w:t xml:space="preserve">Geliştirici ekip hikâyenin tonu için, sıradan insanların olağanüstü durumlara düştüğü anlatıları referans aldığını belirtmiştir; bölümler de kahramanlık gösterisinden çok sahadaki kargaşayı anlatır. HowLongToBeat verilerine göre ana hikâyeyi bitirmek </w:t>
+        <w:t xml:space="preserve">Bu tercih bilinçli. Geliştirici ekip hikâyenin tonu için, sıradan insanların olağanüstü durumlara düştüğü anlatıları referans aldığını belirtmiştir; bölümler de kahramanlık gösterisinden çok sahadaki kargaşayı anlatır. Süre tarafında ise HowLongToBeat verilerine göre ana hikâyeyi bitirmek </w:t>
       </w:r>
       <w:r>
         <w:rPr>
@@ -484,7 +484,20 @@
           <w:color w:val="10332F"/>
           <w:sz w:val="21"/>
         </w:rPr>
-        <w:t xml:space="preserve">Battlefield 6'da tanklar, helikopterler ve savaş uçakları oynanışın merkezinde yer alıyor. </w:t>
+        <w:t>Sınıflar asıl anlamını takım içinde kazanıyor. Support'un bıraktığı mühimmat, Engineer'in onardığı tank ve Recon'un işaretlediği hedef aynı çatışmanın parçaları oluyor; bir zırhlının ilerlemesi çoğu zaman arkasındaki piyade desteğine bağlı kalıyor. Battlefield'ın büyük ölçekli çatışma hissi de buradan geliyor: tek başına iyi nişan almak yetmiyor, timin ne yaptığı sonucu değiştiriyor.</w:t>
+      </w:r>
+    </w:p>
+    <w:p>
+      <w:pPr>
+        <w:spacing w:after="140"/>
+      </w:pPr>
+      <w:r>
+        <w:rPr>
+          <w:rFonts w:ascii="Calibri" w:hAnsi="Calibri"/>
+          <w:color w:val="10332F"/>
+          <w:sz w:val="21"/>
+        </w:rPr>
+        <w:t xml:space="preserve">Battlefield 6'da tanklar, helikopterler ve savaş uçakları oynanışın merkezinde yer alıyor. Araçlar haritada sınırsız değil; kaybedilen bir zırhlı cephenin dengesini bozabiliyor, bu yüzden Engineer'in onarım rolü maç boyunca işe yarıyor. </w:t>
       </w:r>
       <w:r>
         <w:rPr>
@@ -772,7 +785,7 @@
           <w:color w:val="10332F"/>
           <w:sz w:val="26"/>
         </w:rPr>
-        <w:t>Battlefield 6 Atmosferi, Ses Tasarımı ve Müziği</w:t>
+        <w:t>Battlefield 6 Atmosferi ve Ses Tasarımı</w:t>
       </w:r>
     </w:p>
     <w:p>
@@ -785,7 +798,7 @@
           <w:color w:val="10332F"/>
           <w:sz w:val="21"/>
         </w:rPr>
-        <w:t>Oyunun tonu bilinçli olarak gerçekçiliği öne çıkaracak şekildedir ve sanat tasarımı bu tona uyar: yıkılan binanın tozu, çatışma ilerledikçe değişen harita silueti ve sesin geldiği yön atmosferi taşıyan unsurlar arasında yer alır. Renk paleti abartılı değil; savaş alanı maç ilerledikçe kirleniyor, moloz ve duman haritanın görünüşünü değiştiriyor. Bir maçın son dakikalarındaki savaş alanı, ilk dakikalardakiyle aynı yer gibi durmuyor.</w:t>
+        <w:t>Battlefield 6, gerçekçiliği öne çıkaran bir ton üzerine kurulu ve sanat tasarımı da bu tona uyuyor. Renk paleti abartılı değil; savaş alanı maç ilerledikçe kirleniyor, moloz ve duman haritanın görünüşünü değiştiriyor. Bir maçın son dakikalarındaki savaş alanı, ilk dakikalardakiyle aynı yer gibi durmuyor.</w:t>
       </w:r>
     </w:p>
     <w:p>
@@ -798,24 +811,7 @@
           <w:color w:val="10332F"/>
           <w:sz w:val="21"/>
         </w:rPr>
-        <w:t xml:space="preserve">Ses tasarımı oyunun en çok konuşulan tarafı. Silah, araç ve yıkım sesleri ayrı katmanlar hâlinde duyuluyor; sesin geldiği yön, çatışmada rakibin nerede olduğunu anlamanın en hızlı yolu oluyor. Bu çalışma </w:t>
-      </w:r>
-      <w:r>
-        <w:rPr>
-          <w:rFonts w:ascii="Calibri" w:hAnsi="Calibri"/>
-          <w:b/>
-          <w:color w:val="10332F"/>
-          <w:sz w:val="21"/>
-        </w:rPr>
-        <w:t>The Game Awards 2025'te En İyi Ses Tasarımı ödülünü</w:t>
-      </w:r>
-      <w:r>
-        <w:rPr>
-          <w:rFonts w:ascii="Calibri" w:hAnsi="Calibri"/>
-          <w:color w:val="10332F"/>
-          <w:sz w:val="21"/>
-        </w:rPr>
-        <w:t xml:space="preserve"> kazanmıştır; oyun aynı törende En İyi Aksiyon Oyunu ve En İyi Çok Oyunculu Oyun dallarında da aday gösterilmiştir. Hollywood Music in Media Awards'ta Video Oyunu Müzik Süpervizyonu, Ultra Game Awards'ta ise Yılın Nişancı Oyunu ödülü Battlefield 6'ya gitmiştir.</w:t>
+        <w:t>Yıkım burada yalnızca bir görsel efekt değil. Devrilen bir duvar yeni bir geçiş, çöken bir çatı ise kaybedilmiş bir mevzi anlamına geliyor; haritanın görüntüsü bir süre sonra çatışmanın nasıl gittiğini de anlatır hâle geliyor. Haritalar tek bir tempo üzerine kurulmuyor: geniş alanlar araçlara ve uzun menzile yer bırakırken, her haritanın içindeki Combat Zones bölgeleri yakın mesafe çatışmasını öne çıkarıyor.</w:t>
       </w:r>
     </w:p>
     <w:p>
@@ -828,7 +824,37 @@
           <w:color w:val="10332F"/>
           <w:sz w:val="21"/>
         </w:rPr>
-        <w:t xml:space="preserve">Oyunun müziğini </w:t>
+        <w:t xml:space="preserve">Ses tasarımı ise oyunun en çok konuşulan tarafı oldu. Silah, araç ve yıkım sesleri ayrı katmanlar hâlinde duyuluyor; sesin geldiği yön, rakibin nerede olduğunu anlamanın en hızlı yolu oluyor. Bu emek karşılığını da buldu: </w:t>
+      </w:r>
+      <w:r>
+        <w:rPr>
+          <w:rFonts w:ascii="Calibri" w:hAnsi="Calibri"/>
+          <w:b/>
+          <w:color w:val="10332F"/>
+          <w:sz w:val="21"/>
+        </w:rPr>
+        <w:t>The Game Awards 2025'te En İyi Ses Tasarımı</w:t>
+      </w:r>
+      <w:r>
+        <w:rPr>
+          <w:rFonts w:ascii="Calibri" w:hAnsi="Calibri"/>
+          <w:color w:val="10332F"/>
+          <w:sz w:val="21"/>
+        </w:rPr>
+        <w:t xml:space="preserve"> ödülü Battlefield 6'ya gitmiştir. Oyun aynı törende En İyi Aksiyon Oyunu ve En İyi Çok Oyunculu Oyun dallarında da aday gösterilmiş, Hollywood Music in Media Awards'ta Video Oyunu Müzik Süpervizyonu ve Ultra Game Awards'ta Yılın Nişancı Oyunu ödüllerini kazanmıştır.</w:t>
+      </w:r>
+    </w:p>
+    <w:p>
+      <w:pPr>
+        <w:spacing w:after="140"/>
+      </w:pPr>
+      <w:r>
+        <w:rPr>
+          <w:rFonts w:ascii="Calibri" w:hAnsi="Calibri"/>
+          <w:color w:val="10332F"/>
+          <w:sz w:val="21"/>
+        </w:rPr>
+        <w:t xml:space="preserve">Müzik tarafında iki ayrı imza var. Oyunun müziğini, film müziği tarafından gelen bir isim olan </w:t>
       </w:r>
       <w:r>
         <w:rPr>
@@ -845,7 +871,7 @@
           <w:color w:val="10332F"/>
           <w:sz w:val="21"/>
         </w:rPr>
-        <w:t xml:space="preserve"> bestelemiştir, şarkı seçkisinde ise </w:t>
+        <w:t xml:space="preserve"> bestelemiştir. Şarkı seçkisi ise </w:t>
       </w:r>
       <w:r>
         <w:rPr>
@@ -862,7 +888,7 @@
           <w:color w:val="10332F"/>
           <w:sz w:val="21"/>
         </w:rPr>
-        <w:t xml:space="preserve"> yer almaktadır.</w:t>
+        <w:t xml:space="preserve"> imzası taşımaktadır; grubun oyun için hazırladığı tekli, çıkıştan yaklaşık bir ay önce, 12 Eylül 2025'te yayımlanmıştır.</w:t>
       </w:r>
     </w:p>
     <w:p>
@@ -1152,7 +1178,7 @@
           <w:color w:val="10332F"/>
           <w:sz w:val="21"/>
         </w:rPr>
-        <w:t xml:space="preserve"> arasından kullanım alışkanlığına uyanı seçebilirsin. Performance tarafında 1440p ve 60 FPS'e kadar akış ile 6 saatlik oturum, Ultimate tarafında GeForce RTX 4080 sunucular, 4K HDR, 240 FPS'e kadar akış ile 8 saatlik oturum sunulmaktadır.</w:t>
+        <w:t xml:space="preserve"> arasından kullanım alışkanlığına uyanı seçebilirsin. Paketler arasındaki fark şöyle: Performance tarafında 1440p ve 60 FPS'e kadar akış ile 6 saatlik oturum, Ultimate tarafında GeForce RTX 4080 sunucular, 4K HDR, 240 FPS'e kadar akış ile 8 saatlik oturum sunulmaktadır.</w:t>
       </w:r>
     </w:p>
     <w:p>

</xml_diff>

<commit_message>
Kapanışa Performance / Ultimate paket önerisi (CTA): kurallar, kontrol listesi, BF6 örnekleri, README
Oyuna özel paket gerekliliği yine yazılmıyor; iki paket kapanışta birlikte öneriliyor, fiyat ve paket özelliği yazılmıyor. Örnek brief satırı 30 satır hücre sınırına sığdırıldı.

Co-Authored-By: Claude Opus 5 <noreply@anthropic.com>
</commit_message>
<xml_diff>
--- a/examples/ornek-icerik-battlefield-6.docx
+++ b/examples/ornek-icerik-battlefield-6.docx
@@ -20,7 +20,7 @@
           <w:color w:val="5A6B68"/>
           <w:sz w:val="17"/>
         </w:rPr>
-        <w:t>Gövde 1480 kelime · giriş + 8 H2, 3 H3 · 2 tablo · 6 iç link · 8 SSS · Sayfada H1 oyun adı olarak bulunur; gövde başlıksız kısa girişle açılır, ardından H2'ler gelir</w:t>
+        <w:t>Gövde 1495 kelime · giriş + 8 H2, 3 H3 · 2 tablo · 6 iç link · 8 SSS · Sayfada H1 oyun adı olarak bulunur; gövde başlıksız kısa girişle açılır, ardından H2'ler gelir</w:t>
       </w:r>
     </w:p>
     <w:p>
@@ -2079,7 +2079,41 @@
           <w:color w:val="10332F"/>
           <w:sz w:val="21"/>
         </w:rPr>
-        <w:t xml:space="preserve">Battlefield 6, seriyi bilinen ölçeğine geri döndüren, hem çok oyunculu hem tek oyunculu tarafı dolu bir yapım. GeForce NOW powered by GAME+ ile bu savaş alanına girmek için güçlü bir bilgisayara ihtiyacın yok: hesabını bağla, Oynat'a bas ve </w:t>
+        <w:t xml:space="preserve">Battlefield 6, seriyi bilinen ölçeğine geri döndüren, hem çok oyunculu hem tek oyunculu tarafı dolu bir yapım. GeForce NOW powered by GAME+ ile bu savaş alanına girmek için güçlü bir bilgisayara ihtiyacın yok; oynamak için </w:t>
+      </w:r>
+      <w:r>
+        <w:rPr>
+          <w:rFonts w:ascii="Calibri" w:hAnsi="Calibri"/>
+          <w:b/>
+          <w:color w:val="10332F"/>
+          <w:sz w:val="21"/>
+        </w:rPr>
+        <w:t>Performance</w:t>
+      </w:r>
+      <w:r>
+        <w:rPr>
+          <w:rFonts w:ascii="Calibri" w:hAnsi="Calibri"/>
+          <w:color w:val="10332F"/>
+          <w:sz w:val="21"/>
+        </w:rPr>
+        <w:t xml:space="preserve"> ya da </w:t>
+      </w:r>
+      <w:r>
+        <w:rPr>
+          <w:rFonts w:ascii="Calibri" w:hAnsi="Calibri"/>
+          <w:b/>
+          <w:color w:val="10332F"/>
+          <w:sz w:val="21"/>
+        </w:rPr>
+        <w:t>Ultimate</w:t>
+      </w:r>
+      <w:r>
+        <w:rPr>
+          <w:rFonts w:ascii="Calibri" w:hAnsi="Calibri"/>
+          <w:color w:val="10332F"/>
+          <w:sz w:val="21"/>
+        </w:rPr>
+        <w:t xml:space="preserve"> paketlerinden birini tercih etmen yeterli. Sana uyan paketi seç, hesabını bağla, Oynat'a bas ve </w:t>
       </w:r>
       <w:r>
         <w:rPr>

</xml_diff>

<commit_message>
Paket önerisi: "GeForce NOW Ultimate ya da Performance" (Ultimate önde, hizmet adıyla)
Co-Authored-By: Claude Opus 5 <noreply@anthropic.com>
</commit_message>
<xml_diff>
--- a/examples/ornek-icerik-battlefield-6.docx
+++ b/examples/ornek-icerik-battlefield-6.docx
@@ -2088,7 +2088,7 @@
           <w:color w:val="10332F"/>
           <w:sz w:val="21"/>
         </w:rPr>
-        <w:t>Performance</w:t>
+        <w:t>GeForce NOW Ultimate</w:t>
       </w:r>
       <w:r>
         <w:rPr>
@@ -2105,7 +2105,7 @@
           <w:color w:val="10332F"/>
           <w:sz w:val="21"/>
         </w:rPr>
-        <w:t>Ultimate</w:t>
+        <w:t>Performance</w:t>
       </w:r>
       <w:r>
         <w:rPr>

</xml_diff>

<commit_message>
Türkçe SSS her oyunda, zamandan bağımsız tarih dili, resmi değeri olmayan sayılar için ortalama aralık, düşük puanın korunması
- Türkçe sorusu SSS'de her zaman yer alır; resmi dil değilse 'Hayır' ile yanıtlanır, H2 yalnız resmi destekte
- 'çıkacak/yakında/şu an' yerine tarihli kalıplar ('23 Ekim 2026 çıkış tarihli')
- Kurulum boyutu ve süre için resmi değer yoksa iki kaynaktan ortalama aralık
- Soru biçimi: kullanıcının arattığı ve doğal sözdizimi (brief düzeltmelerinden)
- BF6 örnekleri: Türkçe SSS, 'kampanya' kelimesi temizlendi

Co-Authored-By: Claude Opus 5 <noreply@anthropic.com>
</commit_message>
<xml_diff>
--- a/examples/ornek-icerik-battlefield-6.docx
+++ b/examples/ornek-icerik-battlefield-6.docx
@@ -20,7 +20,7 @@
           <w:color w:val="5A6B68"/>
           <w:sz w:val="17"/>
         </w:rPr>
-        <w:t>Gövde 1495 kelime · giriş + 8 H2, 3 H3 · 2 tablo · 6 iç link · 8 SSS · Sayfada H1 oyun adı olarak bulunur; gövde başlıksız kısa girişle açılır, ardından H2'ler gelir</w:t>
+        <w:t>Gövde 1497 kelime · giriş + 8 H2, 3 H3 · 2 tablo · 6 iç link · 9 SSS · Sayfada H1 oyun adı olarak bulunur; gövde başlıksız kısa girişle açılır, ardından H2'ler gelir</w:t>
       </w:r>
     </w:p>
     <w:p>
@@ -2204,6 +2204,33 @@
           <w:color w:val="10332F"/>
           <w:sz w:val="22"/>
         </w:rPr>
+        <w:t>Battlefield 6 Türkçe mi?</w:t>
+      </w:r>
+    </w:p>
+    <w:p>
+      <w:pPr>
+        <w:spacing w:after="80"/>
+      </w:pPr>
+      <w:r>
+        <w:rPr>
+          <w:rFonts w:ascii="Calibri" w:hAnsi="Calibri"/>
+          <w:color w:val="10332F"/>
+          <w:sz w:val="21"/>
+        </w:rPr>
+        <w:t>Hayır. Battlefield 6'da resmi Türkçe dil desteği bulunmaz; Türkçe arayüz, altyazı ya da seslendirme yoktur. Oyun İngilizce, Almanca, Fransızca, İspanyolca, Arapça, Japonca ve Korece dahil 13 dilde arayüz ve altyazı sunar.</w:t>
+      </w:r>
+    </w:p>
+    <w:p>
+      <w:pPr>
+        <w:spacing w:before="180" w:after="40"/>
+      </w:pPr>
+      <w:r>
+        <w:rPr>
+          <w:rFonts w:ascii="Calibri" w:hAnsi="Calibri"/>
+          <w:b/>
+          <w:color w:val="10332F"/>
+          <w:sz w:val="22"/>
+        </w:rPr>
         <w:t>Battlefield 6 kaç GB?</w:t>
       </w:r>
     </w:p>

</xml_diff>

<commit_message>
Katalog JSON tanıtım metni kaynak olarak eklendi: katalog_json.py betiği, dil alanı olmadığı uyarısı, USK notu
- scripts/katalog_json.py: ham katalog kaydı (uzun tanıtım metni, variant bayrakları, USK, kontroller)
- dogrulama.md: tanıtım metni kaynak satırı + JSON'da dil alanı yok / keywords tür etiketi / contentRatings USK tuzağı
- icerik-kurallari.md ve kontrol-listesi.md: tanıtım metninin taranması ve HDR/Reflex karşılaştırması
- BF6 örneği: Payload, Marine Raiders, Sahra, Portal ayrıntıları, Brooklyn eklendi

Co-Authored-By: Claude Opus 5 <noreply@anthropic.com>
</commit_message>
<xml_diff>
--- a/examples/ornek-icerik-battlefield-6.docx
+++ b/examples/ornek-icerik-battlefield-6.docx
@@ -20,7 +20,7 @@
           <w:color w:val="5A6B68"/>
           <w:sz w:val="17"/>
         </w:rPr>
-        <w:t>Gövde 1497 kelime · giriş + 8 H2, 3 H3 · 2 tablo · 6 iç link · 9 SSS · Sayfada H1 oyun adı olarak bulunur; gövde başlıksız kısa girişle açılır, ardından H2'ler gelir</w:t>
+        <w:t>Gövde 1523 kelime · giriş + 8 H2, 3 H3 · 2 tablo · 6 iç link · 9 SSS · Sayfada H1 oyun adı olarak bulunur; gövde başlıksız kısa girişle açılır, ardından H2'ler gelir</w:t>
       </w:r>
     </w:p>
     <w:p>
@@ -261,7 +261,7 @@
           <w:color w:val="10332F"/>
           <w:sz w:val="21"/>
         </w:rPr>
-        <w:t xml:space="preserve">Oyunun hikâyesinde Pax Armata'ya karşı savaşan </w:t>
+        <w:t xml:space="preserve">Oyunun hikâyesinde Pax Armata'ya karşı savaşan, deniz piyadelerinin akıncı birliğine bağlı </w:t>
       </w:r>
       <w:r>
         <w:rPr>
@@ -278,7 +278,7 @@
           <w:color w:val="10332F"/>
           <w:sz w:val="21"/>
         </w:rPr>
-        <w:t xml:space="preserve"> timiyle oyuna başlıyoruz. Bölümler Cebelitarık, Kahire ve New York gibi farklı cephelerde geçiyor, aralarını sinematik geçişler bağlıyor. Anlatı tek bir kahramanın değil, timin tamamının etrafında kuruluyor; bölüm başına değişen bakış açısı çatışmanın ölçeğini de hissettiriyor.</w:t>
+        <w:t xml:space="preserve"> timiyle oyuna başlıyoruz. Bölümler Sahra'dan Cebelitarık'a, Kahire'den New York'a uzanan farklı cephelerde geçiyor; çölde tank sürüyor, kıyıya çıkarma yapıyor ve şehir savunuyoruz. Aralarını sinematik geçişler bağlıyor. Anlatı tek bir kahramanın değil, timin tamamının etrafında kuruluyor; bölüm başına değişen bakış açısı çatışmanın ölçeğini de hissettiriyor.</w:t>
       </w:r>
     </w:p>
     <w:p>
@@ -514,7 +514,7 @@
           <w:color w:val="10332F"/>
           <w:sz w:val="21"/>
         </w:rPr>
-        <w:t xml:space="preserve"> sistemi sayesinde duvarlar, çatılar ve köprüler çatışmanın gidişatına göre yıkılır; aynı harita her maçta başka bir şekil alır. Haritaların tamamı yıkılamıyor, çünkü ekip bilinçli olarak bir sınır koymuş; amaç haritanın düzleşmesi değil, cephenin değişmesi. Çıkıştaki dokuz haritanın her biri, yakın mesafe çatışması için tasarlanmış </w:t>
+        <w:t xml:space="preserve"> sistemi sayesinde duvarlar, çatılar ve köprüler çatışmanın gidişatına göre yıkılır; aynı harita her maçta başka bir şekil alır. Haritaların tamamı yıkılamıyor, çünkü ekip bilinçli olarak bir sınır koymuş; amaç haritanın düzleşmesi değil, cephenin değişmesi. Haritalar Kahire, Brooklyn ve Cebelitarık gibi dünyanın farklı köşelerinde geçer; çıkıştaki dokuz haritanın her biri, yakın mesafe çatışması için tasarlanmış </w:t>
       </w:r>
       <w:r>
         <w:rPr>
@@ -690,7 +690,7 @@
           <w:color w:val="10332F"/>
           <w:sz w:val="21"/>
         </w:rPr>
-        <w:t>Team Deathmatch, Domination ve King of the Hill:</w:t>
+        <w:t>Team Deathmatch, Domination, Payload ve King of the Hill:</w:t>
       </w:r>
       <w:r>
         <w:rPr>
@@ -721,7 +721,7 @@
           <w:color w:val="10332F"/>
           <w:sz w:val="21"/>
         </w:rPr>
-        <w:t xml:space="preserve"> Serinin farklı dönemlerinden harita ve silahları bir araya getirir. Battlefield 6'da tamamen yenilenen editör, kendi haritanı ve kurallarını kurmana, hazır varlıklarla özel modlar yazmana ve topluluğun hazırladığı modları denemene izin verir.</w:t>
+        <w:t xml:space="preserve"> Serinin farklı dönemlerinden harita ve silahları bir araya getirir. Battlefield 6'da tamamen yenilenen editör; nesneleri taşıyıp ölçeklendirmene, NPC betikleri ve özelleştirilebilir arayüzle kendi kurallarını kurmana ve topluluğun hazırladığı modları denemene izin verir.</w:t>
       </w:r>
     </w:p>
     <w:p>

</xml_diff>

<commit_message>
Erişim cümlesi kuralı, BF6 içerik örneği v3
- icerik-kurallari.md: erişim iki cümle, olasılık kipi (bulabilirsin / başlayabilirsin)
- icerik_denetim.py: 'kütüphanesinde bulur … başlarsın' kalıbı sorun olarak işaretlenir
- examples: BF6 içerik örneği yapı v3 sürümüyle değiştirildi (json + docx)

Co-Authored-By: Claude Opus 5.5 <noreply@anthropic.com>
</commit_message>
<xml_diff>
--- a/examples/ornek-icerik-battlefield-6.docx
+++ b/examples/ornek-icerik-battlefield-6.docx
@@ -23,7 +23,7 @@
           <w:color w:val="10332F"/>
           <w:sz w:val="21"/>
         </w:rPr>
-        <w:t xml:space="preserve">Battlefield serisi 2002'den bu yana geniş ölçekli savaş deneyimini öne çıkaran oyunlardan biridir. Electronic Arts ve DICE'ın başını çektiği Battlefield Studios imzalı Battlefield 6 da bu çizgiyi sürdüren bir yapımdır. 10 Ekim 2025'te yayımlanan oyun, serinin Battlefield 3 ve Battlefield 4 dönemini referans alır. Yakın gelecekte geçen büyük ölçekli bir savaş oyunu olan Battlefield 6; geniş savaş alanları, araç çatışmaları ve yıkılabilir yapılarıyla serinin bilinen imzasını taşır. Savaşı merkezine alan </w:t>
+        <w:t xml:space="preserve">Battlefield serisi 2002'den bu yana geniş ölçekli savaş deneyimini öne çıkaran oyunlardan biridir. Electronic Arts ve DICE'ın başını çektiği Battlefield Studios imzalı Battlefield 6 da bu çizgiyi sürdüren bir yapımdır. 10 Ekim 2025'te yayımlanan oyun, serinin Battlefield 3 ve Battlefield 4 dönemini referans alır. Yakın gelecekte geçen oyun; geniş savaş alanları, araç çatışmaları ve yıkılabilir yapılarıyla serinin bilinen imzasını taşır. Savaşı merkezine alan </w:t>
       </w:r>
       <w:hyperlink r:id="rId9">
         <w:r>
@@ -114,7 +114,7 @@
           <w:color w:val="10332F"/>
           <w:sz w:val="21"/>
         </w:rPr>
-        <w:t xml:space="preserve">Arayüz ve altyazı tarafında İngilizce, Almanca, Fransızca, İspanyolca, Arapça, Japonca ve Korece dahil 13 dil desteklenmektedir; </w:t>
+        <w:t xml:space="preserve">Menü ve altyazı tarafında İngilizce, Almanca, Fransızca, İspanyolca, Arapça, Japonca ve Korece dahil 13 dil desteklenmektedir; </w:t>
       </w:r>
       <w:r>
         <w:rPr>
@@ -123,7 +123,7 @@
           <w:color w:val="10332F"/>
           <w:sz w:val="21"/>
         </w:rPr>
-        <w:t>Türkçe dil desteği bulunmaz</w:t>
+        <w:t>Türkçe menü, altyazı ya da dublaj bulunmaz</w:t>
       </w:r>
       <w:r>
         <w:rPr>
@@ -132,6 +132,117 @@
           <w:sz w:val="21"/>
         </w:rPr>
         <w:t>.</w:t>
+      </w:r>
+    </w:p>
+    <w:p>
+      <w:pPr>
+        <w:pStyle w:val="Heading1"/>
+        <w:spacing w:before="280" w:after="100"/>
+      </w:pPr>
+      <w:r>
+        <w:rPr>
+          <w:rFonts w:ascii="Calibri" w:hAnsi="Calibri"/>
+          <w:b/>
+          <w:color w:val="10332F"/>
+          <w:sz w:val="26"/>
+        </w:rPr>
+        <w:t>Battlefield 6 GeForce NOW'da Nasıl Oynanır?</w:t>
+      </w:r>
+    </w:p>
+    <w:p>
+      <w:pPr>
+        <w:spacing w:after="140"/>
+      </w:pPr>
+      <w:r>
+        <w:rPr>
+          <w:rFonts w:ascii="Calibri" w:hAnsi="Calibri"/>
+          <w:color w:val="10332F"/>
+          <w:sz w:val="21"/>
+        </w:rPr>
+        <w:t xml:space="preserve">Battlefield 6'yı Steam ya da EA App üzerinden satın aldıysan, oyunu GeForce NOW powered by GAME+ kütüphanesinden bulabilirsin. Hesabını bağlayıp </w:t>
+      </w:r>
+      <w:r>
+        <w:rPr>
+          <w:rFonts w:ascii="Calibri" w:hAnsi="Calibri"/>
+          <w:b/>
+          <w:color w:val="10332F"/>
+          <w:sz w:val="21"/>
+        </w:rPr>
+        <w:t>kurulum beklemeden</w:t>
+      </w:r>
+      <w:r>
+        <w:rPr>
+          <w:rFonts w:ascii="Calibri" w:hAnsi="Calibri"/>
+          <w:color w:val="10332F"/>
+          <w:sz w:val="21"/>
+        </w:rPr>
+        <w:t xml:space="preserve"> oynamaya başlayabilirsin. Steam sürümü EA App kurulumu istemez, ancak Steam hesabının bir EA hesabına bağlı olması gerekir. </w:t>
+      </w:r>
+      <w:hyperlink r:id="rId10">
+        <w:r>
+          <w:rPr>
+            <w:color w:val="0B5FB0"/>
+            <w:u w:val="single"/>
+            <w:rFonts w:ascii="Calibri" w:hAnsi="Calibri"/>
+            <w:sz w:val="21"/>
+          </w:rPr>
+          <w:t xml:space="preserve">Bulut oyun</w:t>
+        </w:r>
+      </w:hyperlink>
+      <w:r>
+        <w:rPr>
+          <w:rFonts w:ascii="Calibri" w:hAnsi="Calibri"/>
+          <w:color w:val="10332F"/>
+          <w:sz w:val="21"/>
+        </w:rPr>
+        <w:t xml:space="preserve"> teknolojisiyle oyun NVIDIA'nın sunucularında çalışır, ekranına yalnızca görüntü akar; indirme, güncelleme ve donanım yükü sunucu tarafında kalır.</w:t>
+      </w:r>
+    </w:p>
+    <w:p>
+      <w:pPr>
+        <w:spacing w:after="140"/>
+      </w:pPr>
+      <w:r>
+        <w:rPr>
+          <w:rFonts w:ascii="Calibri" w:hAnsi="Calibri"/>
+          <w:color w:val="10332F"/>
+          <w:sz w:val="21"/>
+        </w:rPr>
+        <w:t xml:space="preserve">Battlefield 6 oyununa sahipsen GAME+ GeForce NOW ile zayıf donanımlı bir dizüstünde, Mac'te, televizyonda ve akıllı telefonda oynayabilirsin. Yeni bir güncelleme çıktığında indirme beklemezsin. Oyun klavye ve fare ile oynanabildiği gibi </w:t>
+      </w:r>
+      <w:r>
+        <w:rPr>
+          <w:rFonts w:ascii="Calibri" w:hAnsi="Calibri"/>
+          <w:b/>
+          <w:color w:val="10332F"/>
+          <w:sz w:val="21"/>
+        </w:rPr>
+        <w:t>gamepad</w:t>
+      </w:r>
+      <w:r>
+        <w:rPr>
+          <w:rFonts w:ascii="Calibri" w:hAnsi="Calibri"/>
+          <w:color w:val="10332F"/>
+          <w:sz w:val="21"/>
+        </w:rPr>
+        <w:t xml:space="preserve"> de destekler; telefonda ya da televizyonda oynarken kumandanı bağlayıp aynı deneyimi sürdürebilirsin. Ücretsiz battle royale </w:t>
+      </w:r>
+      <w:r>
+        <w:rPr>
+          <w:rFonts w:ascii="Calibri" w:hAnsi="Calibri"/>
+          <w:b/>
+          <w:color w:val="10332F"/>
+          <w:sz w:val="21"/>
+        </w:rPr>
+        <w:t>REDSEC</w:t>
+      </w:r>
+      <w:r>
+        <w:rPr>
+          <w:rFonts w:ascii="Calibri" w:hAnsi="Calibri"/>
+          <w:color w:val="10332F"/>
+          <w:sz w:val="21"/>
+        </w:rPr>
+        <w:t xml:space="preserve"> için ise ana oyunu satın alman gerekmez.</w:t>
       </w:r>
     </w:p>
     <w:p>
@@ -281,7 +392,7 @@
           <w:color w:val="10332F"/>
           <w:sz w:val="21"/>
         </w:rPr>
-        <w:t xml:space="preserve"> adlı yeni hareket ve silah sistemi üzerine kurulu. Siperden eğilerek nişan alma, hareket hâlindeki araca tutunma ve yaralı takım arkadaşını güvenli bir yere çekip ayağa kaldırma gibi hareketler birbirine bağlanıyor; çatışma serinin önceki oyunlarına göre daha akıcı bir his veriyor. Silahlar eklentilerle geniş ölçüde kişiselleştirilebiliyor, ancak her silahın taşıyabileceği eklenti sayısı sınırlı; bu sınır kurulumları birbirinden ayırıyor.</w:t>
+        <w:t xml:space="preserve"> adlı yeni hareket ve silah sistemi üzerine kurulu. Siperden eğilerek nişan alma, hareket hâlindeki araca tutunma ve yaralı takım arkadaşını güvenli bir yere çekip ayağa kaldırma gibi hareketler birbirine bağlanıyor; çatışma serinin önceki oyunlarına göre daha akıcı bir his veriyor. Silahlar eklentilerle geniş ölçüde kişiselleştirilebiliyor, ancak her silahın taşıyabileceği eklenti sayısı sınırlı; bu sınır kurulumları birbirinden ayırıyor. GeForce NOW'da bu hareketlerin hiçbiri senin bilgisayarında hesaplanmaz: tuşa bastığında komut internet üzerinden NVIDIA'nın sunucusundaki oyuna gider, sonucu görüntü olarak ekranına döner.</w:t>
       </w:r>
     </w:p>
     <w:p>
@@ -412,7 +523,7 @@
           <w:color w:val="10332F"/>
           <w:sz w:val="21"/>
         </w:rPr>
-        <w:t>Sınıflar asıl anlamını takım içinde kazanıyor. Support'un bıraktığı mühimmat, Engineer'in onardığı tank ve Recon'un işaretlediği hedef aynı çatışmanın parçaları oluyor; bir zırhlının ilerlemesi çoğu zaman arkasındaki piyade desteğine bağlı kalıyor. Battlefield'ın büyük ölçekli çatışma hissi de buradan geliyor: tek başına iyi nişan almak yetmiyor, timin ne yaptığı sonucu değiştiriyor.</w:t>
+        <w:t>Sınıflar asıl anlamını takım içinde kazanıyor: Support'un bıraktığı mühimmat, Engineer'in onardığı tank ve Recon'un işaretlediği hedef aynı çatışmanın parçaları oluyor. Tek başına iyi nişan almak yetmiyor, timin ne yaptığı sonucu değiştiriyor.</w:t>
       </w:r>
     </w:p>
     <w:p>
@@ -425,7 +536,7 @@
           <w:color w:val="10332F"/>
           <w:sz w:val="21"/>
         </w:rPr>
-        <w:t xml:space="preserve">Battlefield 6'da tanklar, helikopterler ve savaş uçakları oynanışın merkezinde yer alıyor. Araçlar haritada sınırsız değil; kaybedilen bir zırhlı cephenin dengesini bozabiliyor, bu yüzden Engineer'in onarım rolü maç boyunca işe yarıyor. </w:t>
+        <w:t xml:space="preserve">Battlefield 6'da tanklar, helikopterler ve savaş uçakları oynanışın merkezinde yer alıyor. Araçlar haritada sınırsız değil; kaybedilen bir zırhlı cephenin dengesini bozabiliyor. </w:t>
       </w:r>
       <w:r>
         <w:rPr>
@@ -472,7 +583,7 @@
           <w:color w:val="10332F"/>
           <w:sz w:val="21"/>
         </w:rPr>
-        <w:t xml:space="preserve">Bu dengenin arkasında uzun bir test süreci var. Oyun DICE, Criterion, Motive ve Ripple Effect stüdyolarının </w:t>
+        <w:t xml:space="preserve">Oyun DICE, Criterion, Motive ve Ripple Effect stüdyolarının </w:t>
       </w:r>
       <w:r>
         <w:rPr>
@@ -489,7 +600,7 @@
           <w:color w:val="10332F"/>
           <w:sz w:val="21"/>
         </w:rPr>
-        <w:t xml:space="preserve"> çatısı altında ortak çalışmasıyla geliştirildi; ekip ayrıca </w:t>
+        <w:t xml:space="preserve"> çatısı altında ortak çalışmasıyla geliştirilmiştir; silah hissinden harita akışına kadar pek çok ayar, </w:t>
       </w:r>
       <w:r>
         <w:rPr>
@@ -506,7 +617,7 @@
           <w:color w:val="10332F"/>
           <w:sz w:val="21"/>
         </w:rPr>
-        <w:t xml:space="preserve"> adıyla kapalı bir oyuncu testi yürüterek silah hissinden harita akışına kadar pek çok ayarı oyunculardan gelen geri bildirimle şekillendirdi.</w:t>
+        <w:t xml:space="preserve"> adlı kapalı oyuncu testinden gelen geri bildirimle şekillenmiştir.</w:t>
       </w:r>
     </w:p>
     <w:p>
@@ -534,7 +645,7 @@
           <w:color w:val="10332F"/>
           <w:sz w:val="21"/>
         </w:rPr>
-        <w:t>Çok oyunculu tarafta öne çıkan modlar şunlardır:</w:t>
+        <w:t>GeForce NOW oyunun PC sürümünü çalıştırdığı için çok oyunculu maçlarda bilgisayardan oynayanlarla aynı sunuculara bağlanırsın. Öne çıkan modlar şunlardır:</w:t>
       </w:r>
     </w:p>
     <w:p>
@@ -662,7 +773,7 @@
           <w:color w:val="10332F"/>
           <w:sz w:val="21"/>
         </w:rPr>
-        <w:t xml:space="preserve">28 Ekim 2025'te eklenen REDSEC, adını “Redacted Sector” ifadesinden alır ve ayrı bir oyun değil, Battlefield 6'nın </w:t>
+        <w:t xml:space="preserve">28 Ekim 2025'te Sezon 1 ile gelen REDSEC, adını “Redacted Sector” ifadesinden alır ve Battlefield 6 evreninde geçen </w:t>
       </w:r>
       <w:r>
         <w:rPr>
@@ -671,7 +782,7 @@
           <w:color w:val="10332F"/>
           <w:sz w:val="21"/>
         </w:rPr>
-        <w:t>ücretsiz oynanan battle royale modudur</w:t>
+        <w:t>ücretsiz bir battle royale</w:t>
       </w:r>
       <w:r>
         <w:rPr>
@@ -679,9 +790,9 @@
           <w:color w:val="10332F"/>
           <w:sz w:val="21"/>
         </w:rPr>
-        <w:t xml:space="preserve">; oyunu satın almadan GeForce NOW üzerinden girebilirsin. Mod, klasik battle royale'in yanında Gauntlet adlı elemeli bir yarışma biçimi de sunar ve Portal desteği taşır. Serinin yıkım ve araç mekanikleri burada da geçerli olduğu için REDSEC, </w:t>
+        <w:t xml:space="preserve">'dür. Steam'de ayrı listelenir; Battlefield 6'yı satın almadan oynanabilir, ana oyun kütüphanendeyse ikisi aynı başlatıcıdan açılır. Klasik battle royale'in yanında Gauntlet adlı elemeli bir yarışma biçimi ve Portal desteği sunar; yıkım ve araç mekanikleri de geçerli olduğu için REDSEC, </w:t>
       </w:r>
-      <w:hyperlink r:id="rId10">
+      <w:hyperlink r:id="rId11">
         <w:r>
           <w:rPr>
             <w:color w:val="0B5FB0"/>
@@ -726,7 +837,7 @@
           <w:color w:val="10332F"/>
           <w:sz w:val="21"/>
         </w:rPr>
-        <w:t>Battlefield 6, gerçekçiliği öne çıkaran bir ton üzerine kurulu ve sanat tasarımı da bu tona uyuyor. Renk paleti abartılı değil; savaş alanı maç ilerledikçe kirleniyor, moloz ve duman haritanın görünüşünü değiştiriyor. Bir maçın son dakikalarındaki savaş alanı, ilk dakikalardakiyle aynı yer gibi durmuyor.</w:t>
+        <w:t>Battlefield 6, gerçekçiliği öne çıkaran bir ton üzerine kurulu ve sanat tasarımı da bu tona uyuyor. Renk paleti abartılı değil; savaş alanı maç ilerledikçe kirleniyor, moloz ve duman haritanın görünüşünü değiştiriyor.</w:t>
       </w:r>
     </w:p>
     <w:p>
@@ -739,7 +850,7 @@
           <w:color w:val="10332F"/>
           <w:sz w:val="21"/>
         </w:rPr>
-        <w:t>Yıkım burada yalnızca bir görsel efekt değil. Devrilen bir duvar yeni bir geçiş, çöken bir çatı ise kaybedilmiş bir mevzi anlamına geliyor; haritanın görüntüsü bir süre sonra çatışmanın nasıl gittiğini de anlatır hâle geliyor. Haritalar tek bir tempo üzerine kurulmuyor: geniş alanlar araçlara ve uzun menzile yer bırakırken, her haritanın içindeki Combat Zones bölgeleri yakın mesafe çatışmasını öne çıkarıyor.</w:t>
+        <w:t>Yıkım burada yalnızca bir görsel efekt değil. Devrilen bir duvar yeni bir geçiş, çöken bir çatı ise kaybedilmiş bir mevzi anlamına geliyor; haritanın görüntüsü bir süre sonra çatışmanın nasıl gittiğini de anlatır hâle geliyor. Toz, duman ve enkazla dolan bu sahneleri GeForce NOW'da NVIDIA'nın sunucusundaki ekran kartı görselleştirir; kalabalık bir maçta bile senin cihazın yalnızca gelen görüntüyü ekrana yansıtır.</w:t>
       </w:r>
     </w:p>
     <w:p>
@@ -971,7 +1082,7 @@
           <w:color w:val="10332F"/>
           <w:sz w:val="26"/>
         </w:rPr>
-        <w:t>Battlefield 6 GeForce NOW'da Nasıl Oynanır?</w:t>
+        <w:t>Battlefield 6'yı GAME+ GeForce NOW ile Oynamak</w:t>
       </w:r>
     </w:p>
     <w:p>
@@ -984,135 +1095,7 @@
           <w:color w:val="10332F"/>
           <w:sz w:val="21"/>
         </w:rPr>
-        <w:t xml:space="preserve">Battlefield 6'yı Steam ya da EA App üzerinden satın aldıysan, oyunu GeForce NOW powered by GAME+ kütüphanesinde bulur, hesabını bağlayıp </w:t>
-      </w:r>
-      <w:r>
-        <w:rPr>
-          <w:rFonts w:ascii="Calibri" w:hAnsi="Calibri"/>
-          <w:b/>
-          <w:color w:val="10332F"/>
-          <w:sz w:val="21"/>
-        </w:rPr>
-        <w:t>kurulum beklemeden</w:t>
-      </w:r>
-      <w:r>
-        <w:rPr>
-          <w:rFonts w:ascii="Calibri" w:hAnsi="Calibri"/>
-          <w:color w:val="10332F"/>
-          <w:sz w:val="21"/>
-        </w:rPr>
-        <w:t xml:space="preserve"> oynamaya başlarsın. </w:t>
-      </w:r>
-      <w:hyperlink r:id="rId11">
-        <w:r>
-          <w:rPr>
-            <w:color w:val="0B5FB0"/>
-            <w:u w:val="single"/>
-            <w:rFonts w:ascii="Calibri" w:hAnsi="Calibri"/>
-            <w:sz w:val="21"/>
-          </w:rPr>
-          <w:t xml:space="preserve">Bulut oyun</w:t>
-        </w:r>
-      </w:hyperlink>
-      <w:r>
-        <w:rPr>
-          <w:rFonts w:ascii="Calibri" w:hAnsi="Calibri"/>
-          <w:color w:val="10332F"/>
-          <w:sz w:val="21"/>
-        </w:rPr>
-        <w:t xml:space="preserve"> teknolojisiyle oyun NVIDIA'nın sunucularında çalışır, ekranına yalnızca görüntü akar; indirme, güncelleme ve donanım yükü sunucu tarafında kalır. Ücretsiz battle royale modu </w:t>
-      </w:r>
-      <w:r>
-        <w:rPr>
-          <w:rFonts w:ascii="Calibri" w:hAnsi="Calibri"/>
-          <w:b/>
-          <w:color w:val="10332F"/>
-          <w:sz w:val="21"/>
-        </w:rPr>
-        <w:t>REDSEC</w:t>
-      </w:r>
-      <w:r>
-        <w:rPr>
-          <w:rFonts w:ascii="Calibri" w:hAnsi="Calibri"/>
-          <w:color w:val="10332F"/>
-          <w:sz w:val="21"/>
-        </w:rPr>
-        <w:t xml:space="preserve"> içinse oyuna sahip olman gerekmez.</w:t>
-      </w:r>
-    </w:p>
-    <w:p>
-      <w:pPr>
-        <w:spacing w:after="140"/>
-      </w:pPr>
-      <w:r>
-        <w:rPr>
-          <w:rFonts w:ascii="Calibri" w:hAnsi="Calibri"/>
-          <w:color w:val="10332F"/>
-          <w:sz w:val="21"/>
-        </w:rPr>
-        <w:t xml:space="preserve">Aynı kütüphane zayıf donanımlı bir dizüstünde, Mac'te, televizyonda ve akıllı telefonda açılır; yeni bir güncelleme çıktığında indirme beklemezsin. Oyun klavye ve fare ile oynanabildiği gibi </w:t>
-      </w:r>
-      <w:r>
-        <w:rPr>
-          <w:rFonts w:ascii="Calibri" w:hAnsi="Calibri"/>
-          <w:b/>
-          <w:color w:val="10332F"/>
-          <w:sz w:val="21"/>
-        </w:rPr>
-        <w:t>gamepad</w:t>
-      </w:r>
-      <w:r>
-        <w:rPr>
-          <w:rFonts w:ascii="Calibri" w:hAnsi="Calibri"/>
-          <w:color w:val="10332F"/>
-          <w:sz w:val="21"/>
-        </w:rPr>
-        <w:t xml:space="preserve"> de destekler; telefonda ya da televizyonda oynarken kumandanı bağlayıp aynı deneyimi sürdürebilirsin.</w:t>
-      </w:r>
-    </w:p>
-    <w:p>
-      <w:pPr>
-        <w:pStyle w:val="Heading2"/>
-        <w:spacing w:before="220" w:after="100"/>
-      </w:pPr>
-      <w:r>
-        <w:rPr>
-          <w:rFonts w:ascii="Calibri" w:hAnsi="Calibri"/>
-          <w:b/>
-          <w:color w:val="10332F"/>
-          <w:sz w:val="23"/>
-        </w:rPr>
-        <w:t>Battlefield 6'yı GAME+ ile Oynamak</w:t>
-      </w:r>
-    </w:p>
-    <w:p>
-      <w:pPr>
-        <w:spacing w:after="140"/>
-      </w:pPr>
-      <w:r>
-        <w:rPr>
-          <w:rFonts w:ascii="Calibri" w:hAnsi="Calibri"/>
-          <w:color w:val="10332F"/>
-          <w:sz w:val="21"/>
-        </w:rPr>
-        <w:t xml:space="preserve">Steam ya da EA App kütüphanendeki Battlefield 6, aynı hesapla GeForce NOW'da açılır; </w:t>
-      </w:r>
-      <w:r>
-        <w:rPr>
-          <w:rFonts w:ascii="Calibri" w:hAnsi="Calibri"/>
-          <w:b/>
-          <w:color w:val="10332F"/>
-          <w:sz w:val="21"/>
-        </w:rPr>
-        <w:t>oyunu satın almış olman yeterlidir</w:t>
-      </w:r>
-      <w:r>
-        <w:rPr>
-          <w:rFonts w:ascii="Calibri" w:hAnsi="Calibri"/>
-          <w:color w:val="10332F"/>
-          <w:sz w:val="21"/>
-        </w:rPr>
-        <w:t xml:space="preserve">. Oynamaya başlamadan önce </w:t>
+        <w:t xml:space="preserve">GAME+ ile Battlefield 6 oynamak için oyunun Steam ya da EA App kopyasına ve bir GeForce NOW paketine sahip olman yeterlidir. Oynamaya başlamadan önce </w:t>
       </w:r>
       <w:hyperlink r:id="rId12">
         <w:r>
@@ -1159,7 +1142,7 @@
           <w:color w:val="10332F"/>
           <w:sz w:val="21"/>
         </w:rPr>
-        <w:t>Deneyimin kalitesini bağlantı hızın belirler:</w:t>
+        <w:t>GeForce NOW'da ihtiyaç duyulan internet hızı, hedeflediğin yayın kalitesine ve oynadığın cihaza göre değişir. NVIDIA'nın önerdiği bağlantı hızları ve bu kalitelerin desteklendiği platformlar şöyle:</w:t>
       </w:r>
     </w:p>
     <w:tbl>
@@ -1192,7 +1175,7 @@
                 <w:color w:val="FFFFFF"/>
                 <w:sz w:val="19"/>
               </w:rPr>
-              <w:t>Bağlantı hızı</w:t>
+              <w:t>Yayın kalitesi</w:t>
             </w:r>
           </w:p>
         </w:tc>
@@ -1213,7 +1196,7 @@
                 <w:color w:val="FFFFFF"/>
                 <w:sz w:val="19"/>
               </w:rPr>
-              <w:t>Çözünürlük</w:t>
+              <w:t>Önerilen bağlantı hızı</w:t>
             </w:r>
           </w:p>
         </w:tc>
@@ -1234,7 +1217,7 @@
                 <w:color w:val="FFFFFF"/>
                 <w:sz w:val="19"/>
               </w:rPr>
-              <w:t>Kare hızı</w:t>
+              <w:t>Platform</w:t>
             </w:r>
           </w:p>
         </w:tc>
@@ -1255,7 +1238,7 @@
                 <w:color w:val="10332F"/>
                 <w:sz w:val="19"/>
               </w:rPr>
-              <w:t>15 Mbps</w:t>
+              <w:t>720p / 60 FPS</w:t>
             </w:r>
           </w:p>
         </w:tc>
@@ -1274,7 +1257,7 @@
                 <w:color w:val="10332F"/>
                 <w:sz w:val="19"/>
               </w:rPr>
-              <w:t>1080p</w:t>
+              <w:t>15 Mbps+</w:t>
             </w:r>
           </w:p>
         </w:tc>
@@ -1293,7 +1276,7 @@
                 <w:color w:val="10332F"/>
                 <w:sz w:val="19"/>
               </w:rPr>
-              <w:t>30 FPS</w:t>
+              <w:t>Win, Mac, Browser, Android, iOS, TV</w:t>
             </w:r>
           </w:p>
         </w:tc>
@@ -1314,7 +1297,7 @@
                 <w:color w:val="10332F"/>
                 <w:sz w:val="19"/>
               </w:rPr>
-              <w:t>35 Mbps</w:t>
+              <w:t>1080p / 60 FPS</w:t>
             </w:r>
           </w:p>
         </w:tc>
@@ -1333,7 +1316,7 @@
                 <w:color w:val="10332F"/>
                 <w:sz w:val="19"/>
               </w:rPr>
-              <w:t>1440p</w:t>
+              <w:t>25 Mbps+</w:t>
             </w:r>
           </w:p>
         </w:tc>
@@ -1352,7 +1335,7 @@
                 <w:color w:val="10332F"/>
                 <w:sz w:val="19"/>
               </w:rPr>
-              <w:t>60 FPS</w:t>
+              <w:t>Win, Mac, Browser, Android, iOS, TV</w:t>
             </w:r>
           </w:p>
         </w:tc>
@@ -1373,7 +1356,7 @@
                 <w:color w:val="10332F"/>
                 <w:sz w:val="19"/>
               </w:rPr>
-              <w:t>50 Mbps</w:t>
+              <w:t>QHD / 120 FPS</w:t>
             </w:r>
           </w:p>
         </w:tc>
@@ -1392,7 +1375,7 @@
                 <w:color w:val="10332F"/>
                 <w:sz w:val="19"/>
               </w:rPr>
-              <w:t>4K</w:t>
+              <w:t>35 Mbps+</w:t>
             </w:r>
           </w:p>
         </w:tc>
@@ -1411,13 +1394,203 @@
                 <w:color w:val="10332F"/>
                 <w:sz w:val="19"/>
               </w:rPr>
-              <w:t>60 FPS</w:t>
+              <w:t>Win, Mac, Browser, Android</w:t>
+            </w:r>
+          </w:p>
+        </w:tc>
+      </w:tr>
+      <w:tr>
+        <w:tc>
+          <w:tcPr>
+            <w:tcW w:type="dxa" w:w="3324"/>
+          </w:tcPr>
+          <w:p>
+            <w:pPr>
+              <w:jc w:val="center"/>
+            </w:pPr>
+            <w:r/>
+            <w:r>
+              <w:rPr>
+                <w:rFonts w:ascii="Calibri" w:hAnsi="Calibri"/>
+                <w:color w:val="10332F"/>
+                <w:sz w:val="19"/>
+              </w:rPr>
+              <w:t>4K / 120 FPS</w:t>
+            </w:r>
+          </w:p>
+        </w:tc>
+        <w:tc>
+          <w:tcPr>
+            <w:tcW w:type="dxa" w:w="3324"/>
+          </w:tcPr>
+          <w:p>
+            <w:pPr>
+              <w:jc w:val="center"/>
+            </w:pPr>
+            <w:r/>
+            <w:r>
+              <w:rPr>
+                <w:rFonts w:ascii="Calibri" w:hAnsi="Calibri"/>
+                <w:color w:val="10332F"/>
+                <w:sz w:val="19"/>
+              </w:rPr>
+              <w:t>45 Mbps+</w:t>
+            </w:r>
+          </w:p>
+        </w:tc>
+        <w:tc>
+          <w:tcPr>
+            <w:tcW w:type="dxa" w:w="3324"/>
+          </w:tcPr>
+          <w:p>
+            <w:pPr>
+              <w:jc w:val="center"/>
+            </w:pPr>
+            <w:r/>
+            <w:r>
+              <w:rPr>
+                <w:rFonts w:ascii="Calibri" w:hAnsi="Calibri"/>
+                <w:color w:val="10332F"/>
+                <w:sz w:val="19"/>
+              </w:rPr>
+              <w:t>Win, Mac, TV</w:t>
+            </w:r>
+          </w:p>
+        </w:tc>
+      </w:tr>
+      <w:tr>
+        <w:tc>
+          <w:tcPr>
+            <w:tcW w:type="dxa" w:w="3324"/>
+          </w:tcPr>
+          <w:p>
+            <w:pPr>
+              <w:jc w:val="center"/>
+            </w:pPr>
+            <w:r/>
+            <w:r>
+              <w:rPr>
+                <w:rFonts w:ascii="Calibri" w:hAnsi="Calibri"/>
+                <w:color w:val="10332F"/>
+                <w:sz w:val="19"/>
+              </w:rPr>
+              <w:t>QHD / 240 FPS</w:t>
+            </w:r>
+          </w:p>
+        </w:tc>
+        <w:tc>
+          <w:tcPr>
+            <w:tcW w:type="dxa" w:w="3324"/>
+          </w:tcPr>
+          <w:p>
+            <w:pPr>
+              <w:jc w:val="center"/>
+            </w:pPr>
+            <w:r/>
+            <w:r>
+              <w:rPr>
+                <w:rFonts w:ascii="Calibri" w:hAnsi="Calibri"/>
+                <w:color w:val="10332F"/>
+                <w:sz w:val="19"/>
+              </w:rPr>
+              <w:t>55 Mbps+</w:t>
+            </w:r>
+          </w:p>
+        </w:tc>
+        <w:tc>
+          <w:tcPr>
+            <w:tcW w:type="dxa" w:w="3324"/>
+          </w:tcPr>
+          <w:p>
+            <w:pPr>
+              <w:jc w:val="center"/>
+            </w:pPr>
+            <w:r/>
+            <w:r>
+              <w:rPr>
+                <w:rFonts w:ascii="Calibri" w:hAnsi="Calibri"/>
+                <w:color w:val="10332F"/>
+                <w:sz w:val="19"/>
+              </w:rPr>
+              <w:t>Win, Mac</w:t>
+            </w:r>
+          </w:p>
+        </w:tc>
+      </w:tr>
+      <w:tr>
+        <w:tc>
+          <w:tcPr>
+            <w:tcW w:type="dxa" w:w="3324"/>
+          </w:tcPr>
+          <w:p>
+            <w:pPr>
+              <w:jc w:val="center"/>
+            </w:pPr>
+            <w:r/>
+            <w:r>
+              <w:rPr>
+                <w:rFonts w:ascii="Calibri" w:hAnsi="Calibri"/>
+                <w:color w:val="10332F"/>
+                <w:sz w:val="19"/>
+              </w:rPr>
+              <w:t>5K / 120 FPS</w:t>
+            </w:r>
+          </w:p>
+        </w:tc>
+        <w:tc>
+          <w:tcPr>
+            <w:tcW w:type="dxa" w:w="3324"/>
+          </w:tcPr>
+          <w:p>
+            <w:pPr>
+              <w:jc w:val="center"/>
+            </w:pPr>
+            <w:r/>
+            <w:r>
+              <w:rPr>
+                <w:rFonts w:ascii="Calibri" w:hAnsi="Calibri"/>
+                <w:color w:val="10332F"/>
+                <w:sz w:val="19"/>
+              </w:rPr>
+              <w:t>65 Mbps+</w:t>
+            </w:r>
+          </w:p>
+        </w:tc>
+        <w:tc>
+          <w:tcPr>
+            <w:tcW w:type="dxa" w:w="3324"/>
+          </w:tcPr>
+          <w:p>
+            <w:pPr>
+              <w:jc w:val="center"/>
+            </w:pPr>
+            <w:r/>
+            <w:r>
+              <w:rPr>
+                <w:rFonts w:ascii="Calibri" w:hAnsi="Calibri"/>
+                <w:color w:val="10332F"/>
+                <w:sz w:val="19"/>
+              </w:rPr>
+              <w:t>Win, Mac</w:t>
             </w:r>
           </w:p>
         </w:tc>
       </w:tr>
     </w:tbl>
     <w:p/>
+    <w:p>
+      <w:pPr>
+        <w:spacing w:after="140"/>
+      </w:pPr>
+      <w:r>
+        <w:rPr>
+          <w:rFonts w:ascii="Calibri" w:hAnsi="Calibri"/>
+          <w:color w:val="10332F"/>
+          <w:sz w:val="21"/>
+        </w:rPr>
+        <w:t>Hızın yanında gecikme de önemlidir: GAME+, cihazınla GeForce NOW veri merkezi arasındaki gecikmenin 80 ms'nin altında olmasını ister, en iyi deneyim için 40 ms'nin altını önerir. Kablolu bağlantı ya da 5 GHz Wi-Fi akışın dalgalanmasını azaltır; bağlantını uygulamanın Ayarlar menüsündeki ağ testiyle ölçebilirsin.</w:t>
+      </w:r>
+    </w:p>
     <w:p>
       <w:pPr>
         <w:spacing w:after="140"/>
@@ -1445,7 +1618,7 @@
           <w:color w:val="10332F"/>
           <w:sz w:val="21"/>
         </w:rPr>
-        <w:t xml:space="preserve"> destekler; Reflex, tetiğe basman ile ekrandaki karşılığı arasındaki gecikmeyi düşürür ve çok oyunculu maçlarda bu fark doğrudan hissedilir. Kablolu bağlantı ya da 5 GHz Wi-Fi, akışın dalgalanmasını azaltır.</w:t>
+        <w:t xml:space="preserve"> destekler; Reflex, tetiğe basman ile ekrandaki karşılığı arasındaki gecikmeyi düşürür ve çok oyunculu maçlarda bu fark doğrudan hissedilir.</w:t>
       </w:r>
     </w:p>
     <w:p>
@@ -1936,24 +2109,7 @@
           <w:color w:val="10332F"/>
           <w:sz w:val="21"/>
         </w:rPr>
-        <w:t xml:space="preserve">Battlefield 6'nın tamamı ücretsiz değil, ancak battle royale modu REDSEC ücretsiz oynanır. Tam sürüm için oyuna sahip olman gerekir; GeForce NOW üzerinde </w:t>
-      </w:r>
-      <w:r>
-        <w:rPr>
-          <w:rFonts w:ascii="Calibri" w:hAnsi="Calibri"/>
-          <w:b/>
-          <w:color w:val="10332F"/>
-          <w:sz w:val="21"/>
-        </w:rPr>
-        <w:t>Steam ve EA App</w:t>
-      </w:r>
-      <w:r>
-        <w:rPr>
-          <w:rFonts w:ascii="Calibri" w:hAnsi="Calibri"/>
-          <w:color w:val="10332F"/>
-          <w:sz w:val="21"/>
-        </w:rPr>
-        <w:t xml:space="preserve"> kütüphaneleri desteklenir, yani oyunu bu iki mağazadan birinden almış olman yeterlidir. GeForce NOW ile oynayabileceğin diğer </w:t>
+        <w:t xml:space="preserve">Battlefield 6'nın tamamı ücretsiz değil, ancak battle royale REDSEC ücretsiz oynanır ve GeForce NOW'daki diğer </w:t>
       </w:r>
       <w:hyperlink r:id="rId14">
         <w:r>
@@ -1972,7 +2128,24 @@
           <w:color w:val="10332F"/>
           <w:sz w:val="21"/>
         </w:rPr>
-        <w:t xml:space="preserve"> için ilgili kategoriyi ziyaret edebilirsin.</w:t>
+        <w:t xml:space="preserve"> gibi yalnızca hesabınla açılır. Tam sürüm için oyuna sahip olman gerekir; GeForce NOW üzerinde </w:t>
+      </w:r>
+      <w:r>
+        <w:rPr>
+          <w:rFonts w:ascii="Calibri" w:hAnsi="Calibri"/>
+          <w:b/>
+          <w:color w:val="10332F"/>
+          <w:sz w:val="21"/>
+        </w:rPr>
+        <w:t>Steam ve EA App</w:t>
+      </w:r>
+      <w:r>
+        <w:rPr>
+          <w:rFonts w:ascii="Calibri" w:hAnsi="Calibri"/>
+          <w:color w:val="10332F"/>
+          <w:sz w:val="21"/>
+        </w:rPr>
+        <w:t xml:space="preserve"> kütüphaneleri desteklenir, yani oyunu bu iki mağazadan birinden almış olman yeterlidir.</w:t>
       </w:r>
     </w:p>
     <w:p>
@@ -2178,7 +2351,7 @@
           <w:color w:val="10332F"/>
           <w:sz w:val="21"/>
         </w:rPr>
-        <w:t>Hayır. Battlefield 6'da resmi Türkçe dil desteği bulunmaz; Türkçe arayüz, altyazı ya da seslendirme yoktur. Oyun İngilizce, Almanca, Fransızca, İspanyolca, Arapça, Japonca ve Korece dahil 13 dilde arayüz ve altyazı sunar.</w:t>
+        <w:t>Hayır. Battlefield 6'da resmi Türkçe dil desteği bulunmaz; Türkçe menü, altyazı ya da dublaj yoktur. Oyun İngilizce, Almanca, Fransızca, İspanyolca, Arapça, Japonca ve Korece dahil 13 dilde menü ve altyazı sunar.</w:t>
       </w:r>
     </w:p>
     <w:p>
@@ -2286,7 +2459,7 @@
           <w:color w:val="10332F"/>
           <w:sz w:val="21"/>
         </w:rPr>
-        <w:t>REDSEC, Battlefield 6'nın 28 Ekim 2025'te eklenen battle royale modu ve ücretsiz oynanır. Ayrı bir oyun değil, Battlefield 6'nın parçası. Oyunu satın almadan GeForce NOW üzerinden REDSEC'e girebilirsin.</w:t>
+        <w:t>REDSEC, Battlefield 6 evreninde geçen ve 28 Ekim 2025'te çıkan ücretsiz bir battle royale'dir. Steam'de ayrı listelenir ve Battlefield 6'ya sahip olmadan oynanabilir; ana oyuna sahipsen iki deneyim aynı başlatıcıdan açılır. REDSEC'e GeForce NOW üzerinden de satın alma yapmadan girebilirsin.</w:t>
       </w:r>
     </w:p>
     <w:p>
@@ -2313,7 +2486,7 @@
           <w:color w:val="10332F"/>
           <w:sz w:val="21"/>
         </w:rPr>
-        <w:t>Hayır. GeForce NOW oyunu bulut sunucularında çalıştırdığı için kesintisiz internet bağlantısı gerekir. Akış kalitesi bağlantı hızına bağlı: 15 Mbps 1080p, 35 Mbps 1440p, 50 Mbps 4K çözünürlük sunar.</w:t>
+        <w:t>Hayır. Battlefield 6'nın PC sürümü kalıcı internet bağlantısı ve EA hesabı ister; GeForce NOW'da da oyun bulutta çalıştığı için bağlantının kesintisiz olması gerekir. GAME+, 1080p ve 60 FPS için 25 Mbps, 4K ve 120 FPS için 45 Mbps hız önerir.</w:t>
       </w:r>
     </w:p>
     <w:p>

</xml_diff>